<commit_message>
Update letters following changes from Government
</commit_message>
<xml_diff>
--- a/arches_her/docx/Blank Adviser Letter.docx
+++ b/arches_her/docx/Blank Adviser Letter.docx
@@ -1,6 +1,6 @@
 
 <file path=word/document.xml><?xml version="1.0" encoding="utf-8"?>
-<w:document xmlns:wpc="http://schemas.microsoft.com/office/word/2010/wordprocessingCanvas" xmlns:cx="http://schemas.microsoft.com/office/drawing/2014/chartex" xmlns:cx1="http://schemas.microsoft.com/office/drawing/2015/9/8/chartex" xmlns:cx2="http://schemas.microsoft.com/office/drawing/2015/10/21/chartex" xmlns:cx3="http://schemas.microsoft.com/office/drawing/2016/5/9/chartex" xmlns:cx4="http://schemas.microsoft.com/office/drawing/2016/5/10/chartex" xmlns:cx5="http://schemas.microsoft.com/office/drawing/2016/5/11/chartex" xmlns:cx6="http://schemas.microsoft.com/office/drawing/2016/5/12/chartex" xmlns:cx7="http://schemas.microsoft.com/office/drawing/2016/5/13/chartex" xmlns:cx8="http://schemas.microsoft.com/office/drawing/2016/5/14/chartex" xmlns:mc="http://schemas.openxmlformats.org/markup-compatibility/2006" xmlns:aink="http://schemas.microsoft.com/office/drawing/2016/ink" xmlns:am3d="http://schemas.microsoft.com/office/drawing/2017/model3d" xmlns:o="urn:schemas-microsoft-com:office:office" xmlns:oel="http://schemas.microsoft.com/office/2019/extlst" xmlns:r="http://schemas.openxmlformats.org/officeDocument/2006/relationships" xmlns:m="http://schemas.openxmlformats.org/officeDocument/2006/math" xmlns:v="urn:schemas-microsoft-com:vml" xmlns:wp14="http://schemas.microsoft.com/office/word/2010/wordprocessingDrawing" xmlns:wp="http://schemas.openxmlformats.org/drawingml/2006/wordprocessingDrawing" xmlns:w10="urn:schemas-microsoft-com:office:word" xmlns:w="http://schemas.openxmlformats.org/wordprocessingml/2006/main" xmlns:w14="http://schemas.microsoft.com/office/word/2010/wordml" xmlns:w15="http://schemas.microsoft.com/office/word/2012/wordml" xmlns:w16cex="http://schemas.microsoft.com/office/word/2018/wordml/cex" xmlns:w16cid="http://schemas.microsoft.com/office/word/2016/wordml/cid" xmlns:w16="http://schemas.microsoft.com/office/word/2018/wordml" xmlns:w16sdtdh="http://schemas.microsoft.com/office/word/2020/wordml/sdtdatahash" xmlns:w16se="http://schemas.microsoft.com/office/word/2015/wordml/symex" xmlns:wpg="http://schemas.microsoft.com/office/word/2010/wordprocessingGroup" xmlns:wpi="http://schemas.microsoft.com/office/word/2010/wordprocessingInk" xmlns:wne="http://schemas.microsoft.com/office/word/2006/wordml" xmlns:wps="http://schemas.microsoft.com/office/word/2010/wordprocessingShape" mc:Ignorable="w14 w15 w16se w16cid w16 w16cex w16sdtdh wp14">
+<w:document xmlns:wpc="http://schemas.microsoft.com/office/word/2010/wordprocessingCanvas" xmlns:cx="http://schemas.microsoft.com/office/drawing/2014/chartex" xmlns:cx1="http://schemas.microsoft.com/office/drawing/2015/9/8/chartex" xmlns:cx2="http://schemas.microsoft.com/office/drawing/2015/10/21/chartex" xmlns:cx3="http://schemas.microsoft.com/office/drawing/2016/5/9/chartex" xmlns:cx4="http://schemas.microsoft.com/office/drawing/2016/5/10/chartex" xmlns:cx5="http://schemas.microsoft.com/office/drawing/2016/5/11/chartex" xmlns:cx6="http://schemas.microsoft.com/office/drawing/2016/5/12/chartex" xmlns:cx7="http://schemas.microsoft.com/office/drawing/2016/5/13/chartex" xmlns:cx8="http://schemas.microsoft.com/office/drawing/2016/5/14/chartex" xmlns:mc="http://schemas.openxmlformats.org/markup-compatibility/2006" xmlns:aink="http://schemas.microsoft.com/office/drawing/2016/ink" xmlns:am3d="http://schemas.microsoft.com/office/drawing/2017/model3d" xmlns:o="urn:schemas-microsoft-com:office:office" xmlns:oel="http://schemas.microsoft.com/office/2019/extlst" xmlns:r="http://schemas.openxmlformats.org/officeDocument/2006/relationships" xmlns:m="http://schemas.openxmlformats.org/officeDocument/2006/math" xmlns:v="urn:schemas-microsoft-com:vml" xmlns:wp14="http://schemas.microsoft.com/office/word/2010/wordprocessingDrawing" xmlns:wp="http://schemas.openxmlformats.org/drawingml/2006/wordprocessingDrawing" xmlns:w10="urn:schemas-microsoft-com:office:word" xmlns:w="http://schemas.openxmlformats.org/wordprocessingml/2006/main" xmlns:w14="http://schemas.microsoft.com/office/word/2010/wordml" xmlns:w15="http://schemas.microsoft.com/office/word/2012/wordml" xmlns:w16cex="http://schemas.microsoft.com/office/word/2018/wordml/cex" xmlns:w16cid="http://schemas.microsoft.com/office/word/2016/wordml/cid" xmlns:w16="http://schemas.microsoft.com/office/word/2018/wordml" xmlns:w16du="http://schemas.microsoft.com/office/word/2023/wordml/word16du" xmlns:w16sdtdh="http://schemas.microsoft.com/office/word/2020/wordml/sdtdatahash" xmlns:w16se="http://schemas.microsoft.com/office/word/2015/wordml/symex" xmlns:wpg="http://schemas.microsoft.com/office/word/2010/wordprocessingGroup" xmlns:wpi="http://schemas.microsoft.com/office/word/2010/wordprocessingInk" xmlns:wne="http://schemas.microsoft.com/office/word/2006/wordml" xmlns:wps="http://schemas.microsoft.com/office/word/2010/wordprocessingShape" mc:Ignorable="w14 w15 w16se w16cid w16 w16cex w16sdtdh w16du wp14">
   <w:body>
     <w:tbl>
       <w:tblPr>
@@ -395,7 +395,7 @@
           <w:b/>
           <w:bCs/>
         </w:rPr>
-        <w:t>3</w:t>
+        <w:t>4</w:t>
       </w:r>
     </w:p>
     <w:p>
@@ -698,15 +698,7 @@
         <w:spacing w:after="0" w:line="240" w:lineRule="auto"/>
       </w:pPr>
       <w:r>
-        <w:t xml:space="preserve">London and </w:t>
-      </w:r>
-      <w:proofErr w:type="gramStart"/>
-      <w:r>
-        <w:t>South East</w:t>
-      </w:r>
-      <w:proofErr w:type="gramEnd"/>
-      <w:r>
-        <w:t xml:space="preserve"> Region</w:t>
+        <w:t>London and South East Region</w:t>
       </w:r>
     </w:p>
     <w:sectPr>
@@ -721,7 +713,7 @@
 </file>
 
 <file path=word/endnotes.xml><?xml version="1.0" encoding="utf-8"?>
-<w:endnotes xmlns:wpc="http://schemas.microsoft.com/office/word/2010/wordprocessingCanvas" xmlns:cx="http://schemas.microsoft.com/office/drawing/2014/chartex" xmlns:cx1="http://schemas.microsoft.com/office/drawing/2015/9/8/chartex" xmlns:cx2="http://schemas.microsoft.com/office/drawing/2015/10/21/chartex" xmlns:cx3="http://schemas.microsoft.com/office/drawing/2016/5/9/chartex" xmlns:cx4="http://schemas.microsoft.com/office/drawing/2016/5/10/chartex" xmlns:cx5="http://schemas.microsoft.com/office/drawing/2016/5/11/chartex" xmlns:cx6="http://schemas.microsoft.com/office/drawing/2016/5/12/chartex" xmlns:cx7="http://schemas.microsoft.com/office/drawing/2016/5/13/chartex" xmlns:cx8="http://schemas.microsoft.com/office/drawing/2016/5/14/chartex" xmlns:mc="http://schemas.openxmlformats.org/markup-compatibility/2006" xmlns:aink="http://schemas.microsoft.com/office/drawing/2016/ink" xmlns:am3d="http://schemas.microsoft.com/office/drawing/2017/model3d" xmlns:o="urn:schemas-microsoft-com:office:office" xmlns:oel="http://schemas.microsoft.com/office/2019/extlst" xmlns:r="http://schemas.openxmlformats.org/officeDocument/2006/relationships" xmlns:m="http://schemas.openxmlformats.org/officeDocument/2006/math" xmlns:v="urn:schemas-microsoft-com:vml" xmlns:wp14="http://schemas.microsoft.com/office/word/2010/wordprocessingDrawing" xmlns:wp="http://schemas.openxmlformats.org/drawingml/2006/wordprocessingDrawing" xmlns:w10="urn:schemas-microsoft-com:office:word" xmlns:w="http://schemas.openxmlformats.org/wordprocessingml/2006/main" xmlns:w14="http://schemas.microsoft.com/office/word/2010/wordml" xmlns:w15="http://schemas.microsoft.com/office/word/2012/wordml" xmlns:w16cex="http://schemas.microsoft.com/office/word/2018/wordml/cex" xmlns:w16cid="http://schemas.microsoft.com/office/word/2016/wordml/cid" xmlns:w16="http://schemas.microsoft.com/office/word/2018/wordml" xmlns:w16sdtdh="http://schemas.microsoft.com/office/word/2020/wordml/sdtdatahash" xmlns:w16se="http://schemas.microsoft.com/office/word/2015/wordml/symex" xmlns:wpg="http://schemas.microsoft.com/office/word/2010/wordprocessingGroup" xmlns:wpi="http://schemas.microsoft.com/office/word/2010/wordprocessingInk" xmlns:wne="http://schemas.microsoft.com/office/word/2006/wordml" xmlns:wps="http://schemas.microsoft.com/office/word/2010/wordprocessingShape" mc:Ignorable="w14 w15 w16se w16cid w16 w16cex w16sdtdh wp14">
+<w:endnotes xmlns:wpc="http://schemas.microsoft.com/office/word/2010/wordprocessingCanvas" xmlns:cx="http://schemas.microsoft.com/office/drawing/2014/chartex" xmlns:cx1="http://schemas.microsoft.com/office/drawing/2015/9/8/chartex" xmlns:cx2="http://schemas.microsoft.com/office/drawing/2015/10/21/chartex" xmlns:cx3="http://schemas.microsoft.com/office/drawing/2016/5/9/chartex" xmlns:cx4="http://schemas.microsoft.com/office/drawing/2016/5/10/chartex" xmlns:cx5="http://schemas.microsoft.com/office/drawing/2016/5/11/chartex" xmlns:cx6="http://schemas.microsoft.com/office/drawing/2016/5/12/chartex" xmlns:cx7="http://schemas.microsoft.com/office/drawing/2016/5/13/chartex" xmlns:cx8="http://schemas.microsoft.com/office/drawing/2016/5/14/chartex" xmlns:mc="http://schemas.openxmlformats.org/markup-compatibility/2006" xmlns:aink="http://schemas.microsoft.com/office/drawing/2016/ink" xmlns:am3d="http://schemas.microsoft.com/office/drawing/2017/model3d" xmlns:o="urn:schemas-microsoft-com:office:office" xmlns:oel="http://schemas.microsoft.com/office/2019/extlst" xmlns:r="http://schemas.openxmlformats.org/officeDocument/2006/relationships" xmlns:m="http://schemas.openxmlformats.org/officeDocument/2006/math" xmlns:v="urn:schemas-microsoft-com:vml" xmlns:wp14="http://schemas.microsoft.com/office/word/2010/wordprocessingDrawing" xmlns:wp="http://schemas.openxmlformats.org/drawingml/2006/wordprocessingDrawing" xmlns:w10="urn:schemas-microsoft-com:office:word" xmlns:w="http://schemas.openxmlformats.org/wordprocessingml/2006/main" xmlns:w14="http://schemas.microsoft.com/office/word/2010/wordml" xmlns:w15="http://schemas.microsoft.com/office/word/2012/wordml" xmlns:w16cex="http://schemas.microsoft.com/office/word/2018/wordml/cex" xmlns:w16cid="http://schemas.microsoft.com/office/word/2016/wordml/cid" xmlns:w16="http://schemas.microsoft.com/office/word/2018/wordml" xmlns:w16du="http://schemas.microsoft.com/office/word/2023/wordml/word16du" xmlns:w16sdtdh="http://schemas.microsoft.com/office/word/2020/wordml/sdtdatahash" xmlns:w16se="http://schemas.microsoft.com/office/word/2015/wordml/symex" xmlns:wpg="http://schemas.microsoft.com/office/word/2010/wordprocessingGroup" xmlns:wpi="http://schemas.microsoft.com/office/word/2010/wordprocessingInk" xmlns:wne="http://schemas.microsoft.com/office/word/2006/wordml" xmlns:wps="http://schemas.microsoft.com/office/word/2010/wordprocessingShape" mc:Ignorable="w14 w15 w16se w16cid w16 w16cex w16sdtdh w16du wp14">
   <w:endnote w:type="separator" w:id="-1">
     <w:p>
       <w:pPr>
@@ -746,7 +738,7 @@
 </file>
 
 <file path=word/footer1.xml><?xml version="1.0" encoding="utf-8"?>
-<w:ftr xmlns:wpc="http://schemas.microsoft.com/office/word/2010/wordprocessingCanvas" xmlns:cx="http://schemas.microsoft.com/office/drawing/2014/chartex" xmlns:cx1="http://schemas.microsoft.com/office/drawing/2015/9/8/chartex" xmlns:cx2="http://schemas.microsoft.com/office/drawing/2015/10/21/chartex" xmlns:cx3="http://schemas.microsoft.com/office/drawing/2016/5/9/chartex" xmlns:cx4="http://schemas.microsoft.com/office/drawing/2016/5/10/chartex" xmlns:cx5="http://schemas.microsoft.com/office/drawing/2016/5/11/chartex" xmlns:cx6="http://schemas.microsoft.com/office/drawing/2016/5/12/chartex" xmlns:cx7="http://schemas.microsoft.com/office/drawing/2016/5/13/chartex" xmlns:cx8="http://schemas.microsoft.com/office/drawing/2016/5/14/chartex" xmlns:mc="http://schemas.openxmlformats.org/markup-compatibility/2006" xmlns:aink="http://schemas.microsoft.com/office/drawing/2016/ink" xmlns:am3d="http://schemas.microsoft.com/office/drawing/2017/model3d" xmlns:o="urn:schemas-microsoft-com:office:office" xmlns:oel="http://schemas.microsoft.com/office/2019/extlst" xmlns:r="http://schemas.openxmlformats.org/officeDocument/2006/relationships" xmlns:m="http://schemas.openxmlformats.org/officeDocument/2006/math" xmlns:v="urn:schemas-microsoft-com:vml" xmlns:wp14="http://schemas.microsoft.com/office/word/2010/wordprocessingDrawing" xmlns:wp="http://schemas.openxmlformats.org/drawingml/2006/wordprocessingDrawing" xmlns:w10="urn:schemas-microsoft-com:office:word" xmlns:w="http://schemas.openxmlformats.org/wordprocessingml/2006/main" xmlns:w14="http://schemas.microsoft.com/office/word/2010/wordml" xmlns:w15="http://schemas.microsoft.com/office/word/2012/wordml" xmlns:w16cex="http://schemas.microsoft.com/office/word/2018/wordml/cex" xmlns:w16cid="http://schemas.microsoft.com/office/word/2016/wordml/cid" xmlns:w16="http://schemas.microsoft.com/office/word/2018/wordml" xmlns:w16sdtdh="http://schemas.microsoft.com/office/word/2020/wordml/sdtdatahash" xmlns:w16se="http://schemas.microsoft.com/office/word/2015/wordml/symex" xmlns:wpg="http://schemas.microsoft.com/office/word/2010/wordprocessingGroup" xmlns:wpi="http://schemas.microsoft.com/office/word/2010/wordprocessingInk" xmlns:wne="http://schemas.microsoft.com/office/word/2006/wordml" xmlns:wps="http://schemas.microsoft.com/office/word/2010/wordprocessingShape" mc:Ignorable="w14 w15 w16se w16cid w16 w16cex w16sdtdh wp14">
+<w:ftr xmlns:wpc="http://schemas.microsoft.com/office/word/2010/wordprocessingCanvas" xmlns:cx="http://schemas.microsoft.com/office/drawing/2014/chartex" xmlns:cx1="http://schemas.microsoft.com/office/drawing/2015/9/8/chartex" xmlns:cx2="http://schemas.microsoft.com/office/drawing/2015/10/21/chartex" xmlns:cx3="http://schemas.microsoft.com/office/drawing/2016/5/9/chartex" xmlns:cx4="http://schemas.microsoft.com/office/drawing/2016/5/10/chartex" xmlns:cx5="http://schemas.microsoft.com/office/drawing/2016/5/11/chartex" xmlns:cx6="http://schemas.microsoft.com/office/drawing/2016/5/12/chartex" xmlns:cx7="http://schemas.microsoft.com/office/drawing/2016/5/13/chartex" xmlns:cx8="http://schemas.microsoft.com/office/drawing/2016/5/14/chartex" xmlns:mc="http://schemas.openxmlformats.org/markup-compatibility/2006" xmlns:aink="http://schemas.microsoft.com/office/drawing/2016/ink" xmlns:am3d="http://schemas.microsoft.com/office/drawing/2017/model3d" xmlns:o="urn:schemas-microsoft-com:office:office" xmlns:oel="http://schemas.microsoft.com/office/2019/extlst" xmlns:r="http://schemas.openxmlformats.org/officeDocument/2006/relationships" xmlns:m="http://schemas.openxmlformats.org/officeDocument/2006/math" xmlns:v="urn:schemas-microsoft-com:vml" xmlns:wp14="http://schemas.microsoft.com/office/word/2010/wordprocessingDrawing" xmlns:wp="http://schemas.openxmlformats.org/drawingml/2006/wordprocessingDrawing" xmlns:w10="urn:schemas-microsoft-com:office:word" xmlns:w="http://schemas.openxmlformats.org/wordprocessingml/2006/main" xmlns:w14="http://schemas.microsoft.com/office/word/2010/wordml" xmlns:w15="http://schemas.microsoft.com/office/word/2012/wordml" xmlns:w16cex="http://schemas.microsoft.com/office/word/2018/wordml/cex" xmlns:w16cid="http://schemas.microsoft.com/office/word/2016/wordml/cid" xmlns:w16="http://schemas.microsoft.com/office/word/2018/wordml" xmlns:w16du="http://schemas.microsoft.com/office/word/2023/wordml/word16du" xmlns:w16sdtdh="http://schemas.microsoft.com/office/word/2020/wordml/sdtdatahash" xmlns:w16se="http://schemas.microsoft.com/office/word/2015/wordml/symex" xmlns:wpg="http://schemas.microsoft.com/office/word/2010/wordprocessingGroup" xmlns:wpi="http://schemas.microsoft.com/office/word/2010/wordprocessingInk" xmlns:wne="http://schemas.microsoft.com/office/word/2006/wordml" xmlns:wps="http://schemas.microsoft.com/office/word/2010/wordprocessingShape" mc:Ignorable="w14 w15 w16se w16cid w16 w16cex w16sdtdh w16du wp14">
   <w:tbl>
     <w:tblPr>
       <w:tblW w:w="10438" w:type="dxa"/>
@@ -898,25 +890,7 @@
               <w:spacing w:val="5"/>
               <w:sz w:val="16"/>
             </w:rPr>
-            <w:t xml:space="preserve">25 </w:t>
-          </w:r>
-          <w:proofErr w:type="spellStart"/>
-          <w:r>
-            <w:rPr>
-              <w:rFonts w:eastAsia="Calibri"/>
-              <w:spacing w:val="5"/>
-              <w:sz w:val="16"/>
-            </w:rPr>
-            <w:t>Dowgate</w:t>
-          </w:r>
-          <w:proofErr w:type="spellEnd"/>
-          <w:r>
-            <w:rPr>
-              <w:rFonts w:eastAsia="Calibri"/>
-              <w:spacing w:val="5"/>
-              <w:sz w:val="16"/>
-            </w:rPr>
-            <w:t xml:space="preserve"> Hill, </w:t>
+            <w:t xml:space="preserve">25 Dowgate Hill, </w:t>
           </w:r>
           <w:r>
             <w:rPr>
@@ -967,25 +941,7 @@
               <w:spacing w:val="5"/>
               <w:sz w:val="16"/>
             </w:rPr>
-            <w:t xml:space="preserve">Telephone 020 7973 </w:t>
-          </w:r>
-          <w:proofErr w:type="gramStart"/>
-          <w:r>
-            <w:rPr>
-              <w:rFonts w:eastAsia="Calibri"/>
-              <w:spacing w:val="5"/>
-              <w:sz w:val="16"/>
-            </w:rPr>
-            <w:t>3700  Facsimile</w:t>
-          </w:r>
-          <w:proofErr w:type="gramEnd"/>
-          <w:r>
-            <w:rPr>
-              <w:rFonts w:eastAsia="Calibri"/>
-              <w:spacing w:val="5"/>
-              <w:sz w:val="16"/>
-            </w:rPr>
-            <w:t xml:space="preserve"> 020 7973 3001</w:t>
+            <w:t>Telephone 020 7973 3700  Facsimile 020 7973 3001</w:t>
           </w:r>
         </w:p>
         <w:p>
@@ -1098,7 +1054,7 @@
 </file>
 
 <file path=word/footnotes.xml><?xml version="1.0" encoding="utf-8"?>
-<w:footnotes xmlns:wpc="http://schemas.microsoft.com/office/word/2010/wordprocessingCanvas" xmlns:cx="http://schemas.microsoft.com/office/drawing/2014/chartex" xmlns:cx1="http://schemas.microsoft.com/office/drawing/2015/9/8/chartex" xmlns:cx2="http://schemas.microsoft.com/office/drawing/2015/10/21/chartex" xmlns:cx3="http://schemas.microsoft.com/office/drawing/2016/5/9/chartex" xmlns:cx4="http://schemas.microsoft.com/office/drawing/2016/5/10/chartex" xmlns:cx5="http://schemas.microsoft.com/office/drawing/2016/5/11/chartex" xmlns:cx6="http://schemas.microsoft.com/office/drawing/2016/5/12/chartex" xmlns:cx7="http://schemas.microsoft.com/office/drawing/2016/5/13/chartex" xmlns:cx8="http://schemas.microsoft.com/office/drawing/2016/5/14/chartex" xmlns:mc="http://schemas.openxmlformats.org/markup-compatibility/2006" xmlns:aink="http://schemas.microsoft.com/office/drawing/2016/ink" xmlns:am3d="http://schemas.microsoft.com/office/drawing/2017/model3d" xmlns:o="urn:schemas-microsoft-com:office:office" xmlns:oel="http://schemas.microsoft.com/office/2019/extlst" xmlns:r="http://schemas.openxmlformats.org/officeDocument/2006/relationships" xmlns:m="http://schemas.openxmlformats.org/officeDocument/2006/math" xmlns:v="urn:schemas-microsoft-com:vml" xmlns:wp14="http://schemas.microsoft.com/office/word/2010/wordprocessingDrawing" xmlns:wp="http://schemas.openxmlformats.org/drawingml/2006/wordprocessingDrawing" xmlns:w10="urn:schemas-microsoft-com:office:word" xmlns:w="http://schemas.openxmlformats.org/wordprocessingml/2006/main" xmlns:w14="http://schemas.microsoft.com/office/word/2010/wordml" xmlns:w15="http://schemas.microsoft.com/office/word/2012/wordml" xmlns:w16cex="http://schemas.microsoft.com/office/word/2018/wordml/cex" xmlns:w16cid="http://schemas.microsoft.com/office/word/2016/wordml/cid" xmlns:w16="http://schemas.microsoft.com/office/word/2018/wordml" xmlns:w16sdtdh="http://schemas.microsoft.com/office/word/2020/wordml/sdtdatahash" xmlns:w16se="http://schemas.microsoft.com/office/word/2015/wordml/symex" xmlns:wpg="http://schemas.microsoft.com/office/word/2010/wordprocessingGroup" xmlns:wpi="http://schemas.microsoft.com/office/word/2010/wordprocessingInk" xmlns:wne="http://schemas.microsoft.com/office/word/2006/wordml" xmlns:wps="http://schemas.microsoft.com/office/word/2010/wordprocessingShape" mc:Ignorable="w14 w15 w16se w16cid w16 w16cex w16sdtdh wp14">
+<w:footnotes xmlns:wpc="http://schemas.microsoft.com/office/word/2010/wordprocessingCanvas" xmlns:cx="http://schemas.microsoft.com/office/drawing/2014/chartex" xmlns:cx1="http://schemas.microsoft.com/office/drawing/2015/9/8/chartex" xmlns:cx2="http://schemas.microsoft.com/office/drawing/2015/10/21/chartex" xmlns:cx3="http://schemas.microsoft.com/office/drawing/2016/5/9/chartex" xmlns:cx4="http://schemas.microsoft.com/office/drawing/2016/5/10/chartex" xmlns:cx5="http://schemas.microsoft.com/office/drawing/2016/5/11/chartex" xmlns:cx6="http://schemas.microsoft.com/office/drawing/2016/5/12/chartex" xmlns:cx7="http://schemas.microsoft.com/office/drawing/2016/5/13/chartex" xmlns:cx8="http://schemas.microsoft.com/office/drawing/2016/5/14/chartex" xmlns:mc="http://schemas.openxmlformats.org/markup-compatibility/2006" xmlns:aink="http://schemas.microsoft.com/office/drawing/2016/ink" xmlns:am3d="http://schemas.microsoft.com/office/drawing/2017/model3d" xmlns:o="urn:schemas-microsoft-com:office:office" xmlns:oel="http://schemas.microsoft.com/office/2019/extlst" xmlns:r="http://schemas.openxmlformats.org/officeDocument/2006/relationships" xmlns:m="http://schemas.openxmlformats.org/officeDocument/2006/math" xmlns:v="urn:schemas-microsoft-com:vml" xmlns:wp14="http://schemas.microsoft.com/office/word/2010/wordprocessingDrawing" xmlns:wp="http://schemas.openxmlformats.org/drawingml/2006/wordprocessingDrawing" xmlns:w10="urn:schemas-microsoft-com:office:word" xmlns:w="http://schemas.openxmlformats.org/wordprocessingml/2006/main" xmlns:w14="http://schemas.microsoft.com/office/word/2010/wordml" xmlns:w15="http://schemas.microsoft.com/office/word/2012/wordml" xmlns:w16cex="http://schemas.microsoft.com/office/word/2018/wordml/cex" xmlns:w16cid="http://schemas.microsoft.com/office/word/2016/wordml/cid" xmlns:w16="http://schemas.microsoft.com/office/word/2018/wordml" xmlns:w16du="http://schemas.microsoft.com/office/word/2023/wordml/word16du" xmlns:w16sdtdh="http://schemas.microsoft.com/office/word/2020/wordml/sdtdatahash" xmlns:w16se="http://schemas.microsoft.com/office/word/2015/wordml/symex" xmlns:wpg="http://schemas.microsoft.com/office/word/2010/wordprocessingGroup" xmlns:wpi="http://schemas.microsoft.com/office/word/2010/wordprocessingInk" xmlns:wne="http://schemas.microsoft.com/office/word/2006/wordml" xmlns:wps="http://schemas.microsoft.com/office/word/2010/wordprocessingShape" mc:Ignorable="w14 w15 w16se w16cid w16 w16cex w16sdtdh w16du wp14">
   <w:footnote w:type="separator" w:id="-1">
     <w:p>
       <w:pPr>
@@ -1123,7 +1079,7 @@
 </file>
 
 <file path=word/styles.xml><?xml version="1.0" encoding="utf-8"?>
-<w:styles xmlns:mc="http://schemas.openxmlformats.org/markup-compatibility/2006" xmlns:r="http://schemas.openxmlformats.org/officeDocument/2006/relationships" xmlns:w="http://schemas.openxmlformats.org/wordprocessingml/2006/main" xmlns:w14="http://schemas.microsoft.com/office/word/2010/wordml" xmlns:w15="http://schemas.microsoft.com/office/word/2012/wordml" xmlns:w16cex="http://schemas.microsoft.com/office/word/2018/wordml/cex" xmlns:w16cid="http://schemas.microsoft.com/office/word/2016/wordml/cid" xmlns:w16="http://schemas.microsoft.com/office/word/2018/wordml" xmlns:w16sdtdh="http://schemas.microsoft.com/office/word/2020/wordml/sdtdatahash" xmlns:w16se="http://schemas.microsoft.com/office/word/2015/wordml/symex" mc:Ignorable="w14 w15 w16se w16cid w16 w16cex w16sdtdh">
+<w:styles xmlns:mc="http://schemas.openxmlformats.org/markup-compatibility/2006" xmlns:r="http://schemas.openxmlformats.org/officeDocument/2006/relationships" xmlns:w="http://schemas.openxmlformats.org/wordprocessingml/2006/main" xmlns:w14="http://schemas.microsoft.com/office/word/2010/wordml" xmlns:w15="http://schemas.microsoft.com/office/word/2012/wordml" xmlns:w16cex="http://schemas.microsoft.com/office/word/2018/wordml/cex" xmlns:w16cid="http://schemas.microsoft.com/office/word/2016/wordml/cid" xmlns:w16="http://schemas.microsoft.com/office/word/2018/wordml" xmlns:w16du="http://schemas.microsoft.com/office/word/2023/wordml/word16du" xmlns:w16sdtdh="http://schemas.microsoft.com/office/word/2020/wordml/sdtdatahash" xmlns:w16se="http://schemas.microsoft.com/office/word/2015/wordml/symex" mc:Ignorable="w14 w15 w16se w16cid w16 w16cex w16sdtdh w16du">
   <w:docDefaults>
     <w:rPrDefault>
       <w:rPr>
@@ -1994,15 +1950,6 @@
 </file>
 
 <file path=customXml/item2.xml><?xml version="1.0" encoding="utf-8"?>
-<?mso-contentType ?>
-<FormTemplates xmlns="http://schemas.microsoft.com/sharepoint/v3/contenttype/forms">
-  <Display>DocumentLibraryForm</Display>
-  <Edit>DocumentLibraryForm</Edit>
-  <New>DocumentLibraryForm</New>
-</FormTemplates>
-</file>
-
-<file path=customXml/item3.xml><?xml version="1.0" encoding="utf-8"?>
 <ct:contentTypeSchema xmlns:ct="http://schemas.microsoft.com/office/2006/metadata/contentType" xmlns:ma="http://schemas.microsoft.com/office/2006/metadata/properties/metaAttributes" ct:_="" ma:_="" ma:contentTypeName="Document" ma:contentTypeID="0x010100B414C6717266E74190F05281F89E6026" ma:contentTypeVersion="17" ma:contentTypeDescription="Create a new document." ma:contentTypeScope="" ma:versionID="2343acd8ed4986af9035717c377e987b">
   <xsd:schema xmlns:xsd="http://www.w3.org/2001/XMLSchema" xmlns:xs="http://www.w3.org/2001/XMLSchema" xmlns:p="http://schemas.microsoft.com/office/2006/metadata/properties" xmlns:ns2="06cfe00f-839a-4df9-b5c7-4ebac7d0c360" xmlns:ns3="610ec4a7-94b8-4d25-ad4b-84626814a18d" xmlns:ns4="bb952b06-3268-4e55-b0fe-9eb49669fc08" targetNamespace="http://schemas.microsoft.com/office/2006/metadata/properties" ma:root="true" ma:fieldsID="80560962e75b60efe544312e13b264a5" ns2:_="" ns3:_="" ns4:_="">
     <xsd:import namespace="06cfe00f-839a-4df9-b5c7-4ebac7d0c360"/>
@@ -2258,6 +2205,15 @@
 </ct:contentTypeSchema>
 </file>
 
+<file path=customXml/item3.xml><?xml version="1.0" encoding="utf-8"?>
+<?mso-contentType ?>
+<FormTemplates xmlns="http://schemas.microsoft.com/sharepoint/v3/contenttype/forms">
+  <Display>DocumentLibraryForm</Display>
+  <Edit>DocumentLibraryForm</Edit>
+  <New>DocumentLibraryForm</New>
+</FormTemplates>
+</file>
+
 <file path=customXml/itemProps1.xml><?xml version="1.0" encoding="utf-8"?>
 <ds:datastoreItem xmlns:ds="http://schemas.openxmlformats.org/officeDocument/2006/customXml" ds:itemID="{5C7AE9E9-0CB8-4407-AF10-4E5D381709F6}">
   <ds:schemaRefs>
@@ -2270,14 +2226,6 @@
 </file>
 
 <file path=customXml/itemProps2.xml><?xml version="1.0" encoding="utf-8"?>
-<ds:datastoreItem xmlns:ds="http://schemas.openxmlformats.org/officeDocument/2006/customXml" ds:itemID="{A5F0A144-934D-4A66-917F-A2E57EEB6C14}">
-  <ds:schemaRefs>
-    <ds:schemaRef ds:uri="http://schemas.microsoft.com/sharepoint/v3/contenttype/forms"/>
-  </ds:schemaRefs>
-</ds:datastoreItem>
-</file>
-
-<file path=customXml/itemProps3.xml><?xml version="1.0" encoding="utf-8"?>
 <ds:datastoreItem xmlns:ds="http://schemas.openxmlformats.org/officeDocument/2006/customXml" ds:itemID="{5A6C0E50-7B7F-4115-9006-E88C6F1E8495}">
   <ds:schemaRefs>
     <ds:schemaRef ds:uri="http://schemas.microsoft.com/office/2006/metadata/contentType"/>
@@ -2295,4 +2243,12 @@
     <ds:schemaRef ds:uri="http://schemas.microsoft.com/internal/obd"/>
   </ds:schemaRefs>
 </ds:datastoreItem>
+</file>
+
+<file path=customXml/itemProps3.xml><?xml version="1.0" encoding="utf-8"?>
+<ds:datastoreItem xmlns:ds="http://schemas.openxmlformats.org/officeDocument/2006/customXml" ds:itemID="{A5F0A144-934D-4A66-917F-A2E57EEB6C14}">
+  <ds:schemaRefs>
+    <ds:schemaRef ds:uri="http://schemas.microsoft.com/sharepoint/v3/contenttype/forms"/>
+  </ds:schemaRefs>
+</ds:datastoreItem>
 </file>
</xml_diff>

<commit_message>
Update all letters with the correct templates
</commit_message>
<xml_diff>
--- a/arches_her/docx/Blank Adviser Letter.docx
+++ b/arches_her/docx/Blank Adviser Letter.docx
@@ -23,13 +23,13 @@
         <w:tblLook w:val="04A0" w:firstRow="1" w:lastRow="0" w:firstColumn="1" w:lastColumn="0" w:noHBand="0" w:noVBand="1"/>
       </w:tblPr>
       <w:tblGrid>
-        <w:gridCol w:w="6384"/>
-        <w:gridCol w:w="3681"/>
+        <w:gridCol w:w="6363"/>
+        <w:gridCol w:w="3702"/>
       </w:tblGrid>
       <w:tr>
         <w:tc>
           <w:tcPr>
-            <w:tcW w:w="6384" w:type="dxa"/>
+            <w:tcW w:w="6363" w:type="dxa"/>
           </w:tcPr>
           <w:p>
             <w:pPr>
@@ -41,7 +41,7 @@
         </w:tc>
         <w:tc>
           <w:tcPr>
-            <w:tcW w:w="3681" w:type="dxa"/>
+            <w:tcW w:w="3702" w:type="dxa"/>
           </w:tcPr>
           <w:p>
             <w:pPr>
@@ -55,7 +55,7 @@
       <w:tr>
         <w:tc>
           <w:tcPr>
-            <w:tcW w:w="6384" w:type="dxa"/>
+            <w:tcW w:w="6363" w:type="dxa"/>
           </w:tcPr>
           <w:p>
             <w:pPr>
@@ -76,7 +76,7 @@
         </w:tc>
         <w:tc>
           <w:tcPr>
-            <w:tcW w:w="3681" w:type="dxa"/>
+            <w:tcW w:w="3702" w:type="dxa"/>
           </w:tcPr>
           <w:p>
             <w:pPr>
@@ -99,7 +99,7 @@
       <w:tr>
         <w:tc>
           <w:tcPr>
-            <w:tcW w:w="6384" w:type="dxa"/>
+            <w:tcW w:w="6363" w:type="dxa"/>
           </w:tcPr>
           <w:p>
             <w:pPr>
@@ -120,7 +120,7 @@
         </w:tc>
         <w:tc>
           <w:tcPr>
-            <w:tcW w:w="3681" w:type="dxa"/>
+            <w:tcW w:w="3702" w:type="dxa"/>
           </w:tcPr>
           <w:p>
             <w:pPr>
@@ -143,7 +143,7 @@
       <w:tr>
         <w:tc>
           <w:tcPr>
-            <w:tcW w:w="6384" w:type="dxa"/>
+            <w:tcW w:w="6363" w:type="dxa"/>
           </w:tcPr>
           <w:p>
             <w:pPr>
@@ -158,7 +158,7 @@
         </w:tc>
         <w:tc>
           <w:tcPr>
-            <w:tcW w:w="3681" w:type="dxa"/>
+            <w:tcW w:w="3702" w:type="dxa"/>
           </w:tcPr>
           <w:p>
             <w:pPr>
@@ -175,7 +175,7 @@
       <w:tr>
         <w:tc>
           <w:tcPr>
-            <w:tcW w:w="6384" w:type="dxa"/>
+            <w:tcW w:w="6363" w:type="dxa"/>
           </w:tcPr>
           <w:p>
             <w:pPr>
@@ -190,7 +190,7 @@
         </w:tc>
         <w:tc>
           <w:tcPr>
-            <w:tcW w:w="3681" w:type="dxa"/>
+            <w:tcW w:w="3702" w:type="dxa"/>
           </w:tcPr>
           <w:p>
             <w:pPr>
@@ -213,7 +213,7 @@
       <w:tr>
         <w:tc>
           <w:tcPr>
-            <w:tcW w:w="6384" w:type="dxa"/>
+            <w:tcW w:w="6363" w:type="dxa"/>
           </w:tcPr>
           <w:p>
             <w:pPr>
@@ -228,7 +228,7 @@
         </w:tc>
         <w:tc>
           <w:tcPr>
-            <w:tcW w:w="3681" w:type="dxa"/>
+            <w:tcW w:w="3702" w:type="dxa"/>
           </w:tcPr>
           <w:p>
             <w:pPr>
@@ -243,7 +243,7 @@
               <w:rPr>
                 <w:rFonts w:cstheme="minorHAnsi"/>
               </w:rPr>
-              <w:t xml:space="preserve">Direct Dial: &lt;Casework Officer Number&gt; </w:t>
+              <w:t xml:space="preserve">&lt;Casework Officer Number&gt; </w:t>
             </w:r>
           </w:p>
         </w:tc>
@@ -251,7 +251,7 @@
       <w:tr>
         <w:tc>
           <w:tcPr>
-            <w:tcW w:w="6384" w:type="dxa"/>
+            <w:tcW w:w="6363" w:type="dxa"/>
           </w:tcPr>
           <w:p>
             <w:pPr>
@@ -266,7 +266,57 @@
         </w:tc>
         <w:tc>
           <w:tcPr>
-            <w:tcW w:w="3681" w:type="dxa"/>
+            <w:tcW w:w="3702" w:type="dxa"/>
+          </w:tcPr>
+          <w:p>
+            <w:pPr>
+              <w:tabs>
+                <w:tab w:val="left" w:pos="5812"/>
+              </w:tabs>
+              <w:rPr>
+                <w:rFonts w:cstheme="minorHAnsi"/>
+              </w:rPr>
+            </w:pPr>
+            <w:r>
+              <w:rPr>
+                <w:rFonts w:cstheme="minorHAnsi"/>
+              </w:rPr>
+              <w:t xml:space="preserve">&lt;Casework Officer </w:t>
+            </w:r>
+            <w:r>
+              <w:rPr>
+                <w:rFonts w:cstheme="minorHAnsi"/>
+              </w:rPr>
+              <w:t>Email</w:t>
+            </w:r>
+            <w:r>
+              <w:rPr>
+                <w:rFonts w:cstheme="minorHAnsi"/>
+              </w:rPr>
+              <w:t>&gt;</w:t>
+            </w:r>
+          </w:p>
+        </w:tc>
+      </w:tr>
+      <w:tr>
+        <w:tc>
+          <w:tcPr>
+            <w:tcW w:w="6363" w:type="dxa"/>
+          </w:tcPr>
+          <w:p>
+            <w:pPr>
+              <w:tabs>
+                <w:tab w:val="left" w:pos="5812"/>
+              </w:tabs>
+              <w:rPr>
+                <w:rFonts w:cstheme="minorHAnsi"/>
+              </w:rPr>
+            </w:pPr>
+          </w:p>
+        </w:tc>
+        <w:tc>
+          <w:tcPr>
+            <w:tcW w:w="3702" w:type="dxa"/>
           </w:tcPr>
           <w:p>
             <w:pPr>
@@ -291,7 +341,16 @@
               <w:rPr>
                 <w:rFonts w:cstheme="minorHAnsi"/>
               </w:rPr>
-              <w:t>&lt;Completion Date&gt;</w:t>
+              <w:t>&lt;Completion Date</w:t>
+            </w:r>
+            <w:r>
+              <w:t>||%Y-%m-%d||%d %B %Y</w:t>
+            </w:r>
+            <w:r>
+              <w:rPr>
+                <w:rFonts w:cstheme="minorHAnsi"/>
+              </w:rPr>
+              <w:t>&gt;</w:t>
             </w:r>
           </w:p>
         </w:tc>
@@ -402,7 +461,15 @@
           <w:b/>
           <w:bCs/>
         </w:rPr>
-        <w:t>NATIONAL PLANNING POLICY FRAMEWORK 2021</w:t>
+        <w:t>NATIONAL PLANNING POLICY FRAMEWORK 202</w:t>
+      </w:r>
+      <w:r>
+        <w:rPr>
+          <w:rFonts w:cstheme="minorHAnsi"/>
+          <w:b/>
+          <w:bCs/>
+        </w:rPr>
+        <w:t>4</w:t>
       </w:r>
     </w:p>
     <w:p>
@@ -461,12 +528,20 @@
         <w:rPr>
           <w:rFonts w:cstheme="minorHAnsi"/>
         </w:rPr>
-        <w:t>&lt;Proposal Description&gt;</w:t>
+        <w:t>&lt;Proposal Description||HTML||PLAIN&gt;</w:t>
       </w:r>
       <w:r>
         <w:rPr>
           <w:rFonts w:cstheme="minorHAnsi"/>
           <w:i/>
+        </w:rPr>
+      </w:r>
+      <w:r>
+        <w:rPr>
+          <w:rFonts w:cs="Arial"/>
+          <w:bCs/>
+          <w:i/>
+          <w:iCs/>
         </w:rPr>
       </w:r>
       <w:r>
@@ -495,18 +570,51 @@
         </w:tabs>
         <w:spacing w:after="0" w:line="240" w:lineRule="auto"/>
         <w:rPr>
-          <w:rFonts w:cstheme="minorHAnsi"/>
           <w:b/>
           <w:u w:val="single"/>
         </w:rPr>
       </w:pPr>
       <w:r>
         <w:rPr>
-          <w:rFonts w:cstheme="minorHAnsi"/>
           <w:b/>
           <w:u w:val="single"/>
         </w:rPr>
-        <w:t>Recommend Approval of Post-Excavation Assessment and its programme to complete analysis, publication, dissemination and archiving of the archaeological investigation</w:t>
+        <w:t xml:space="preserve">GLAAS Archaeological Advice: </w:t>
+      </w:r>
+      <w:r>
+        <w:rPr>
+          <w:b/>
+          <w:u w:val="single"/>
+        </w:rPr>
+        <w:t xml:space="preserve">See </w:t>
+      </w:r>
+      <w:r>
+        <w:rPr>
+          <w:b/>
+          <w:u w:val="single"/>
+        </w:rPr>
+        <w:t>R</w:t>
+      </w:r>
+      <w:r>
+        <w:rPr>
+          <w:b/>
+          <w:u w:val="single"/>
+        </w:rPr>
+        <w:t xml:space="preserve">ecommendations </w:t>
+      </w:r>
+      <w:r>
+        <w:rPr>
+          <w:b/>
+          <w:u w:val="single"/>
+        </w:rPr>
+        <w:t>B</w:t>
+      </w:r>
+      <w:r>
+        <w:rPr>
+          <w:b/>
+          <w:u w:val="single"/>
+        </w:rPr>
+        <w:t>elow</w:t>
       </w:r>
     </w:p>
     <w:p>
@@ -534,7 +642,13 @@
         <w:rPr>
           <w:rFonts w:cstheme="minorHAnsi"/>
         </w:rPr>
-        <w:t>Thank you for your consultation received on &lt;Log Date&gt;.</w:t>
+        <w:t>Thank you for your consultation received on &lt;Log Date||%Y-%m-%d||%d %B %Y&gt;.</w:t>
+      </w:r>
+      <w:r/>
+      <w:r>
+        <w:rPr>
+          <w:rFonts w:cstheme="minorHAnsi"/>
+        </w:rPr>
       </w:r>
     </w:p>
     <w:p>
@@ -590,7 +704,13 @@
         <w:rPr>
           <w:rFonts w:cstheme="minorHAnsi"/>
         </w:rPr>
-        <w:t>&lt;Condition Type&gt;</w:t>
+        <w:t>&lt;Assessment of Significance&gt;</w:t>
+      </w:r>
+      <w:r/>
+      <w:r>
+        <w:rPr>
+          <w:rFonts w:cstheme="minorHAnsi"/>
+        </w:rPr>
       </w:r>
     </w:p>
     <w:p>
@@ -603,12 +723,6 @@
           <w:rFonts w:cstheme="minorHAnsi"/>
         </w:rPr>
       </w:pPr>
-      <w:r>
-        <w:rPr>
-          <w:rFonts w:cstheme="minorHAnsi"/>
-        </w:rPr>
-        <w:t>&lt;Condition&gt;</w:t>
-      </w:r>
     </w:p>
     <w:p>
       <w:pPr>
@@ -620,6 +734,12 @@
           <w:rFonts w:cstheme="minorHAnsi"/>
         </w:rPr>
       </w:pPr>
+      <w:r>
+        <w:rPr>
+          <w:rFonts w:cstheme="minorHAnsi"/>
+        </w:rPr>
+        <w:t>This response relates solely to archaeological issues.</w:t>
+      </w:r>
     </w:p>
     <w:p>
       <w:pPr>
@@ -629,28 +749,10 @@
         <w:spacing w:after="0" w:line="240" w:lineRule="auto"/>
         <w:rPr>
           <w:rFonts w:cstheme="minorHAnsi"/>
-        </w:rPr>
-      </w:pPr>
-      <w:r>
-        <w:rPr>
-          <w:rFonts w:cstheme="minorHAnsi"/>
-        </w:rPr>
-        <w:t xml:space="preserve">Having considered the submitted document, I recommend its approval. However, the further work set out in the document must be completed </w:t>
-      </w:r>
-      <w:proofErr w:type="gramStart"/>
-      <w:r>
-        <w:rPr>
-          <w:rFonts w:cstheme="minorHAnsi"/>
-        </w:rPr>
-        <w:t>in order to</w:t>
-      </w:r>
-      <w:proofErr w:type="gramEnd"/>
-      <w:r>
-        <w:rPr>
-          <w:rFonts w:cstheme="minorHAnsi"/>
-        </w:rPr>
-        <w:t xml:space="preserve"> satisfy the archaeological condition.</w:t>
-      </w:r>
+          <w:b/>
+          <w:u w:val="single"/>
+        </w:rPr>
+      </w:pPr>
     </w:p>
     <w:p>
       <w:pPr>
@@ -662,6 +764,12 @@
           <w:rFonts w:cstheme="minorHAnsi"/>
         </w:rPr>
       </w:pPr>
+      <w:r>
+        <w:rPr>
+          <w:rFonts w:cstheme="minorHAnsi"/>
+        </w:rPr>
+        <w:t>Yours sincerely</w:t>
+      </w:r>
     </w:p>
     <w:p>
       <w:pPr>
@@ -673,12 +781,6 @@
           <w:rFonts w:cstheme="minorHAnsi"/>
         </w:rPr>
       </w:pPr>
-      <w:r>
-        <w:rPr>
-          <w:rFonts w:cstheme="minorHAnsi"/>
-        </w:rPr>
-        <w:t>This response relates solely to archaeological issues.</w:t>
-      </w:r>
     </w:p>
     <w:p>
       <w:pPr>
@@ -688,10 +790,14 @@
         <w:spacing w:after="0" w:line="240" w:lineRule="auto"/>
         <w:rPr>
           <w:rFonts w:cstheme="minorHAnsi"/>
-          <w:b/>
-          <w:u w:val="single"/>
-        </w:rPr>
-      </w:pPr>
+        </w:rPr>
+      </w:pPr>
+      <w:r>
+        <w:rPr>
+          <w:rFonts w:cstheme="minorHAnsi"/>
+        </w:rPr>
+        <w:t>&lt;Casework Officer&gt;</w:t>
+      </w:r>
     </w:p>
     <w:p>
       <w:pPr>
@@ -703,12 +809,6 @@
           <w:rFonts w:cstheme="minorHAnsi"/>
         </w:rPr>
       </w:pPr>
-      <w:r>
-        <w:rPr>
-          <w:rFonts w:cstheme="minorHAnsi"/>
-        </w:rPr>
-        <w:t>Yours sincerely</w:t>
-      </w:r>
     </w:p>
     <w:p>
       <w:pPr>
@@ -720,6 +820,12 @@
           <w:rFonts w:cstheme="minorHAnsi"/>
         </w:rPr>
       </w:pPr>
+      <w:r>
+        <w:rPr>
+          <w:rFonts w:cstheme="minorHAnsi"/>
+        </w:rPr>
+        <w:t>Archaeology Adviser</w:t>
+      </w:r>
     </w:p>
     <w:p>
       <w:pPr>
@@ -735,7 +841,7 @@
         <w:rPr>
           <w:rFonts w:cstheme="minorHAnsi"/>
         </w:rPr>
-        <w:t>&lt;Casework Officer&gt;</w:t>
+        <w:t>Greater London Archaeological Advisory Service</w:t>
       </w:r>
     </w:p>
     <w:p>
@@ -752,60 +858,23 @@
         <w:rPr>
           <w:rFonts w:cstheme="minorHAnsi"/>
         </w:rPr>
-        <w:lastRenderedPageBreak/>
-        <w:t>Archaeology Adviser</w:t>
+        <w:t xml:space="preserve">London and </w:t>
+      </w:r>
+      <w:proofErr w:type="gramStart"/>
+      <w:r>
+        <w:rPr>
+          <w:rFonts w:cstheme="minorHAnsi"/>
+        </w:rPr>
+        <w:t>South East</w:t>
+      </w:r>
+      <w:proofErr w:type="gramEnd"/>
+      <w:r>
+        <w:rPr>
+          <w:rFonts w:cstheme="minorHAnsi"/>
+        </w:rPr>
+        <w:t xml:space="preserve"> Region</w:t>
       </w:r>
     </w:p>
-    <w:p>
-      <w:pPr>
-        <w:tabs>
-          <w:tab w:val="left" w:pos="5245"/>
-        </w:tabs>
-        <w:spacing w:after="0" w:line="240" w:lineRule="auto"/>
-        <w:rPr>
-          <w:rFonts w:cstheme="minorHAnsi"/>
-        </w:rPr>
-      </w:pPr>
-      <w:r>
-        <w:rPr>
-          <w:rFonts w:cstheme="minorHAnsi"/>
-        </w:rPr>
-        <w:t>Greater London Archaeological Advisory Service</w:t>
-      </w:r>
-    </w:p>
-    <w:p>
-      <w:pPr>
-        <w:tabs>
-          <w:tab w:val="left" w:pos="5245"/>
-        </w:tabs>
-        <w:spacing w:after="0" w:line="240" w:lineRule="auto"/>
-        <w:rPr>
-          <w:rFonts w:cstheme="minorHAnsi"/>
-        </w:rPr>
-      </w:pPr>
-      <w:r>
-        <w:rPr>
-          <w:rFonts w:cstheme="minorHAnsi"/>
-        </w:rPr>
-        <w:t xml:space="preserve">London and </w:t>
-      </w:r>
-      <w:proofErr w:type="gramStart"/>
-      <w:r>
-        <w:rPr>
-          <w:rFonts w:cstheme="minorHAnsi"/>
-        </w:rPr>
-        <w:t>South East</w:t>
-      </w:r>
-      <w:proofErr w:type="gramEnd"/>
-      <w:r>
-        <w:rPr>
-          <w:rFonts w:cstheme="minorHAnsi"/>
-        </w:rPr>
-        <w:t xml:space="preserve"> Region</w:t>
-      </w:r>
-    </w:p>
-    <w:p/>
-    <w:p/>
     <w:sectPr>
       <w:headerReference w:type="even" r:id="rId11"/>
       <w:headerReference w:type="default" r:id="rId12"/>
@@ -1979,7 +2048,7 @@
   <w:style w:type="paragraph" w:default="1" w:styleId="Normal">
     <w:name w:val="Normal"/>
     <w:qFormat/>
-    <w:rsid w:val="00DA104F"/>
+    <w:rsid w:val="00233215"/>
   </w:style>
   <w:style w:type="paragraph" w:styleId="Heading1">
     <w:name w:val="heading 1"/>

</xml_diff>

<commit_message>
Fix issues with tags in xml document
</commit_message>
<xml_diff>
--- a/arches_her/docx/Blank Adviser Letter.docx
+++ b/arches_her/docx/Blank Adviser Letter.docx
@@ -281,19 +281,7 @@
               <w:rPr>
                 <w:rFonts w:cstheme="minorHAnsi"/>
               </w:rPr>
-              <w:t xml:space="preserve">&lt;Casework Officer </w:t>
-            </w:r>
-            <w:r>
-              <w:rPr>
-                <w:rFonts w:cstheme="minorHAnsi"/>
-              </w:rPr>
-              <w:t>Email</w:t>
-            </w:r>
-            <w:r>
-              <w:rPr>
-                <w:rFonts w:cstheme="minorHAnsi"/>
-              </w:rPr>
-              <w:t>&gt;</w:t>
+              <w:t>&lt;Casework Officer Email&gt;</w:t>
             </w:r>
           </w:p>
         </w:tc>
@@ -341,16 +329,7 @@
               <w:rPr>
                 <w:rFonts w:cstheme="minorHAnsi"/>
               </w:rPr>
-              <w:t>&lt;Completion Date</w:t>
-            </w:r>
-            <w:r>
-              <w:t>||%Y-%m-%d||%d %B %Y</w:t>
-            </w:r>
-            <w:r>
-              <w:rPr>
-                <w:rFonts w:cstheme="minorHAnsi"/>
-              </w:rPr>
-              <w:t>&gt;</w:t>
+              <w:t>&lt;Completion Date||%Y-%m-%d||%d %B %Y&gt;</w:t>
             </w:r>
           </w:p>
         </w:tc>
@@ -397,20 +376,7 @@
         <w:rPr>
           <w:rFonts w:cstheme="minorHAnsi"/>
         </w:rPr>
-        <w:t xml:space="preserve">Dear </w:t>
-      </w:r>
-      <w:r>
-        <w:rPr>
-          <w:rFonts w:cstheme="minorHAnsi"/>
-          <w:noProof/>
-        </w:rPr>
-        <w:t>&lt;Contact Name&gt;</w:t>
-      </w:r>
-      <w:r>
-        <w:rPr>
-          <w:rFonts w:cstheme="minorHAnsi"/>
-        </w:rPr>
-        <w:t>,</w:t>
+        <w:t>Dear &lt;Contact Name&gt;,</w:t>
       </w:r>
     </w:p>
     <w:p>
@@ -522,32 +488,17 @@
         <w:spacing w:after="0" w:line="240" w:lineRule="auto"/>
         <w:rPr>
           <w:rFonts w:cstheme="minorHAnsi"/>
-        </w:rPr>
-      </w:pPr>
-      <w:r>
-        <w:rPr>
-          <w:rFonts w:cstheme="minorHAnsi"/>
-        </w:rPr>
-        <w:t>&lt;Proposal Description||HTML||PLAIN&gt;</w:t>
-      </w:r>
-      <w:r>
-        <w:rPr>
-          <w:rFonts w:cstheme="minorHAnsi"/>
-          <w:i/>
-        </w:rPr>
-      </w:r>
-      <w:r>
-        <w:rPr>
-          <w:rFonts w:cs="Arial"/>
-          <w:bCs/>
           <w:i/>
           <w:iCs/>
         </w:rPr>
-      </w:r>
+      </w:pPr>
       <w:r>
         <w:rPr>
           <w:rFonts w:cstheme="minorHAnsi"/>
-        </w:rPr>
+          <w:i/>
+          <w:iCs/>
+        </w:rPr>
+        <w:t>&lt;Proposal Description||HTML||PLAIN&gt;</w:t>
       </w:r>
     </w:p>
     <w:p>
@@ -570,51 +521,20 @@
         </w:tabs>
         <w:spacing w:after="0" w:line="240" w:lineRule="auto"/>
         <w:rPr>
+          <w:rFonts w:cstheme="minorHAnsi"/>
           <w:b/>
+          <w:bCs/>
           <w:u w:val="single"/>
         </w:rPr>
       </w:pPr>
       <w:r>
         <w:rPr>
+          <w:rFonts w:cstheme="minorHAnsi"/>
           <w:b/>
+          <w:bCs/>
           <w:u w:val="single"/>
         </w:rPr>
-        <w:t xml:space="preserve">GLAAS Archaeological Advice: </w:t>
-      </w:r>
-      <w:r>
-        <w:rPr>
-          <w:b/>
-          <w:u w:val="single"/>
-        </w:rPr>
-        <w:t xml:space="preserve">See </w:t>
-      </w:r>
-      <w:r>
-        <w:rPr>
-          <w:b/>
-          <w:u w:val="single"/>
-        </w:rPr>
-        <w:t>R</w:t>
-      </w:r>
-      <w:r>
-        <w:rPr>
-          <w:b/>
-          <w:u w:val="single"/>
-        </w:rPr>
-        <w:t xml:space="preserve">ecommendations </w:t>
-      </w:r>
-      <w:r>
-        <w:rPr>
-          <w:b/>
-          <w:u w:val="single"/>
-        </w:rPr>
-        <w:t>B</w:t>
-      </w:r>
-      <w:r>
-        <w:rPr>
-          <w:b/>
-          <w:u w:val="single"/>
-        </w:rPr>
-        <w:t>elow</w:t>
+        <w:t>GLAAS Archaeological Advice: See Recommendations Below</w:t>
       </w:r>
     </w:p>
     <w:p>
@@ -644,12 +564,6 @@
         </w:rPr>
         <w:t>Thank you for your consultation received on &lt;Log Date||%Y-%m-%d||%d %B %Y&gt;.</w:t>
       </w:r>
-      <w:r/>
-      <w:r>
-        <w:rPr>
-          <w:rFonts w:cstheme="minorHAnsi"/>
-        </w:rPr>
-      </w:r>
     </w:p>
     <w:p>
       <w:pPr>
@@ -706,12 +620,6 @@
         </w:rPr>
         <w:t>&lt;Assessment of Significance&gt;</w:t>
       </w:r>
-      <w:r/>
-      <w:r>
-        <w:rPr>
-          <w:rFonts w:cstheme="minorHAnsi"/>
-        </w:rPr>
-      </w:r>
     </w:p>
     <w:p>
       <w:pPr>
@@ -858,21 +766,7 @@
         <w:rPr>
           <w:rFonts w:cstheme="minorHAnsi"/>
         </w:rPr>
-        <w:t xml:space="preserve">London and </w:t>
-      </w:r>
-      <w:proofErr w:type="gramStart"/>
-      <w:r>
-        <w:rPr>
-          <w:rFonts w:cstheme="minorHAnsi"/>
-        </w:rPr>
-        <w:t>South East</w:t>
-      </w:r>
-      <w:proofErr w:type="gramEnd"/>
-      <w:r>
-        <w:rPr>
-          <w:rFonts w:cstheme="minorHAnsi"/>
-        </w:rPr>
-        <w:t xml:space="preserve"> Region</w:t>
+        <w:t>London and South East Region</w:t>
       </w:r>
     </w:p>
     <w:sectPr>
@@ -1164,16 +1058,15 @@
         <w:sz w:val="16"/>
         <w:szCs w:val="16"/>
       </w:rPr>
-      <w:t xml:space="preserve">020 7973 </w:t>
+      <w:t>020 7973 3700</w:t>
     </w:r>
-    <w:proofErr w:type="gramStart"/>
     <w:r>
       <w:rPr>
         <w:rFonts w:ascii="Arial" w:hAnsi="Arial"/>
         <w:sz w:val="16"/>
         <w:szCs w:val="16"/>
       </w:rPr>
-      <w:t>3700</w:t>
+      <w:t xml:space="preserve">  </w:t>
     </w:r>
     <w:r>
       <w:rPr>
@@ -1181,24 +1074,7 @@
         <w:sz w:val="16"/>
         <w:szCs w:val="16"/>
       </w:rPr>
-      <w:t xml:space="preserve">  </w:t>
-    </w:r>
-    <w:r>
-      <w:rPr>
-        <w:rFonts w:ascii="Arial" w:hAnsi="Arial"/>
-        <w:sz w:val="16"/>
-        <w:szCs w:val="16"/>
-      </w:rPr>
-      <w:t>|</w:t>
-    </w:r>
-    <w:proofErr w:type="gramEnd"/>
-    <w:r>
-      <w:rPr>
-        <w:rFonts w:ascii="Arial" w:hAnsi="Arial"/>
-        <w:sz w:val="16"/>
-        <w:szCs w:val="16"/>
-      </w:rPr>
-      <w:t xml:space="preserve">  </w:t>
+      <w:t xml:space="preserve">|  </w:t>
     </w:r>
     <w:r>
       <w:rPr>
@@ -2926,26 +2802,6 @@
 </file>
 
 <file path=customXml/item1.xml><?xml version="1.0" encoding="utf-8"?>
-<p:properties xmlns:p="http://schemas.microsoft.com/office/2006/metadata/properties" xmlns:xsi="http://www.w3.org/2001/XMLSchema-instance" xmlns:pc="http://schemas.microsoft.com/office/infopath/2007/PartnerControls">
-  <documentManagement>
-    <lcf76f155ced4ddcb4097134ff3c332f xmlns="e789b7fa-a83c-4c6b-9e01-87c723f67228">
-      <Terms xmlns="http://schemas.microsoft.com/office/infopath/2007/PartnerControls"/>
-    </lcf76f155ced4ddcb4097134ff3c332f>
-    <TaxCatchAll xmlns="bb952b06-3268-4e55-b0fe-9eb49669fc08" xsi:nil="true"/>
-  </documentManagement>
-</p:properties>
-</file>
-
-<file path=customXml/item2.xml><?xml version="1.0" encoding="utf-8"?>
-<?mso-contentType ?>
-<FormTemplates xmlns="http://schemas.microsoft.com/sharepoint/v3/contenttype/forms">
-  <Display>DocumentLibraryForm</Display>
-  <Edit>DocumentLibraryForm</Edit>
-  <New>DocumentLibraryForm</New>
-</FormTemplates>
-</file>
-
-<file path=customXml/item3.xml><?xml version="1.0" encoding="utf-8"?>
 <ct:contentTypeSchema xmlns:ct="http://schemas.microsoft.com/office/2006/metadata/contentType" xmlns:ma="http://schemas.microsoft.com/office/2006/metadata/properties/metaAttributes" ct:_="" ma:_="" ma:contentTypeName="Document" ma:contentTypeID="0x010100B89331DE8EA64F4FBEA00113BF0E4514" ma:contentTypeVersion="11" ma:contentTypeDescription="Create a new document." ma:contentTypeScope="" ma:versionID="0b60b04e60edb8b2e7e2fe1cc7d413e0">
   <xsd:schema xmlns:xsd="http://www.w3.org/2001/XMLSchema" xmlns:xs="http://www.w3.org/2001/XMLSchema" xmlns:p="http://schemas.microsoft.com/office/2006/metadata/properties" xmlns:ns2="e789b7fa-a83c-4c6b-9e01-87c723f67228" xmlns:ns3="bb952b06-3268-4e55-b0fe-9eb49669fc08" targetNamespace="http://schemas.microsoft.com/office/2006/metadata/properties" ma:root="true" ma:fieldsID="52467e30880403e5f73a15b97b0992c8" ns2:_="" ns3:_="">
     <xsd:import namespace="e789b7fa-a83c-4c6b-9e01-87c723f67228"/>
@@ -3140,30 +2996,31 @@
 </ct:contentTypeSchema>
 </file>
 
-<file path=customXml/item4.xml><?xml version="1.0" encoding="utf-8"?>
+<file path=customXml/item2.xml><?xml version="1.0" encoding="utf-8"?>
 <b:Sources xmlns:b="http://schemas.openxmlformats.org/officeDocument/2006/bibliography" xmlns="http://schemas.openxmlformats.org/officeDocument/2006/bibliography" SelectedStyle="/APASixthEditionOfficeOnline.xsl" StyleName="APA" Version="6"/>
 </file>
 
-<file path=customXml/itemProps1.xml><?xml version="1.0" encoding="utf-8"?>
-<ds:datastoreItem xmlns:ds="http://schemas.openxmlformats.org/officeDocument/2006/customXml" ds:itemID="{EF43FDED-CD1D-4301-B761-71C1DCC851CC}">
-  <ds:schemaRefs>
-    <ds:schemaRef ds:uri="http://schemas.microsoft.com/office/2006/metadata/properties"/>
-    <ds:schemaRef ds:uri="http://schemas.microsoft.com/office/infopath/2007/PartnerControls"/>
-    <ds:schemaRef ds:uri="e789b7fa-a83c-4c6b-9e01-87c723f67228"/>
-    <ds:schemaRef ds:uri="bb952b06-3268-4e55-b0fe-9eb49669fc08"/>
-  </ds:schemaRefs>
-</ds:datastoreItem>
+<file path=customXml/item3.xml><?xml version="1.0" encoding="utf-8"?>
+<p:properties xmlns:p="http://schemas.microsoft.com/office/2006/metadata/properties" xmlns:xsi="http://www.w3.org/2001/XMLSchema-instance" xmlns:pc="http://schemas.microsoft.com/office/infopath/2007/PartnerControls">
+  <documentManagement>
+    <lcf76f155ced4ddcb4097134ff3c332f xmlns="e789b7fa-a83c-4c6b-9e01-87c723f67228">
+      <Terms xmlns="http://schemas.microsoft.com/office/infopath/2007/PartnerControls"/>
+    </lcf76f155ced4ddcb4097134ff3c332f>
+    <TaxCatchAll xmlns="bb952b06-3268-4e55-b0fe-9eb49669fc08" xsi:nil="true"/>
+  </documentManagement>
+</p:properties>
 </file>
 
-<file path=customXml/itemProps2.xml><?xml version="1.0" encoding="utf-8"?>
-<ds:datastoreItem xmlns:ds="http://schemas.openxmlformats.org/officeDocument/2006/customXml" ds:itemID="{45FB1F57-968F-4A6E-AEE9-65961EB5FADD}">
-  <ds:schemaRefs>
-    <ds:schemaRef ds:uri="http://schemas.microsoft.com/sharepoint/v3/contenttype/forms"/>
-  </ds:schemaRefs>
-</ds:datastoreItem>
+<file path=customXml/item4.xml><?xml version="1.0" encoding="utf-8"?>
+<?mso-contentType ?>
+<FormTemplates xmlns="http://schemas.microsoft.com/sharepoint/v3/contenttype/forms">
+  <Display>DocumentLibraryForm</Display>
+  <Edit>DocumentLibraryForm</Edit>
+  <New>DocumentLibraryForm</New>
+</FormTemplates>
 </file>
 
-<file path=customXml/itemProps3.xml><?xml version="1.0" encoding="utf-8"?>
+<file path=customXml/itemProps1.xml><?xml version="1.0" encoding="utf-8"?>
 <ds:datastoreItem xmlns:ds="http://schemas.openxmlformats.org/officeDocument/2006/customXml" ds:itemID="{93F00A47-6514-4C46-91C6-8D2331E8318E}">
   <ds:schemaRefs>
     <ds:schemaRef ds:uri="http://schemas.microsoft.com/office/2006/metadata/contentType"/>
@@ -3182,10 +3039,29 @@
 </ds:datastoreItem>
 </file>
 
-<file path=customXml/itemProps4.xml><?xml version="1.0" encoding="utf-8"?>
+<file path=customXml/itemProps2.xml><?xml version="1.0" encoding="utf-8"?>
 <ds:datastoreItem xmlns:ds="http://schemas.openxmlformats.org/officeDocument/2006/customXml" ds:itemID="{3B4892E8-18D6-D444-BA6E-299F0B60384F}">
   <ds:schemaRefs>
     <ds:schemaRef ds:uri="http://schemas.openxmlformats.org/officeDocument/2006/bibliography"/>
   </ds:schemaRefs>
 </ds:datastoreItem>
+</file>
+
+<file path=customXml/itemProps3.xml><?xml version="1.0" encoding="utf-8"?>
+<ds:datastoreItem xmlns:ds="http://schemas.openxmlformats.org/officeDocument/2006/customXml" ds:itemID="{EF43FDED-CD1D-4301-B761-71C1DCC851CC}">
+  <ds:schemaRefs>
+    <ds:schemaRef ds:uri="http://schemas.microsoft.com/office/2006/metadata/properties"/>
+    <ds:schemaRef ds:uri="http://schemas.microsoft.com/office/infopath/2007/PartnerControls"/>
+    <ds:schemaRef ds:uri="e789b7fa-a83c-4c6b-9e01-87c723f67228"/>
+    <ds:schemaRef ds:uri="bb952b06-3268-4e55-b0fe-9eb49669fc08"/>
+  </ds:schemaRefs>
+</ds:datastoreItem>
+</file>
+
+<file path=customXml/itemProps4.xml><?xml version="1.0" encoding="utf-8"?>
+<ds:datastoreItem xmlns:ds="http://schemas.openxmlformats.org/officeDocument/2006/customXml" ds:itemID="{45FB1F57-968F-4A6E-AEE9-65961EB5FADD}">
+  <ds:schemaRefs>
+    <ds:schemaRef ds:uri="http://schemas.microsoft.com/sharepoint/v3/contenttype/forms"/>
+  </ds:schemaRefs>
+</ds:datastoreItem>
 </file>
</xml_diff>

<commit_message>
Update templates with NPFF changes and fix line breaks
</commit_message>
<xml_diff>
--- a/arches_her/docx/Blank Adviser Letter.docx
+++ b/arches_her/docx/Blank Adviser Letter.docx
@@ -1,6 +1,6 @@
 
 <file path=word/document.xml><?xml version="1.0" encoding="utf-8"?>
-<w:document xmlns:wpc="http://schemas.microsoft.com/office/word/2010/wordprocessingCanvas" xmlns:cx="http://schemas.microsoft.com/office/drawing/2014/chartex" xmlns:cx1="http://schemas.microsoft.com/office/drawing/2015/9/8/chartex" xmlns:cx2="http://schemas.microsoft.com/office/drawing/2015/10/21/chartex" xmlns:cx3="http://schemas.microsoft.com/office/drawing/2016/5/9/chartex" xmlns:cx4="http://schemas.microsoft.com/office/drawing/2016/5/10/chartex" xmlns:cx5="http://schemas.microsoft.com/office/drawing/2016/5/11/chartex" xmlns:cx6="http://schemas.microsoft.com/office/drawing/2016/5/12/chartex" xmlns:cx7="http://schemas.microsoft.com/office/drawing/2016/5/13/chartex" xmlns:cx8="http://schemas.microsoft.com/office/drawing/2016/5/14/chartex" xmlns:mc="http://schemas.openxmlformats.org/markup-compatibility/2006" xmlns:aink="http://schemas.microsoft.com/office/drawing/2016/ink" xmlns:am3d="http://schemas.microsoft.com/office/drawing/2017/model3d" xmlns:o="urn:schemas-microsoft-com:office:office" xmlns:oel="http://schemas.microsoft.com/office/2019/extlst" xmlns:r="http://schemas.openxmlformats.org/officeDocument/2006/relationships" xmlns:m="http://schemas.openxmlformats.org/officeDocument/2006/math" xmlns:v="urn:schemas-microsoft-com:vml" xmlns:wp14="http://schemas.microsoft.com/office/word/2010/wordprocessingDrawing" xmlns:wp="http://schemas.openxmlformats.org/drawingml/2006/wordprocessingDrawing" xmlns:w10="urn:schemas-microsoft-com:office:word" xmlns:w="http://schemas.openxmlformats.org/wordprocessingml/2006/main" xmlns:w14="http://schemas.microsoft.com/office/word/2010/wordml" xmlns:w15="http://schemas.microsoft.com/office/word/2012/wordml" xmlns:w16cex="http://schemas.microsoft.com/office/word/2018/wordml/cex" xmlns:w16cid="http://schemas.microsoft.com/office/word/2016/wordml/cid" xmlns:w16="http://schemas.microsoft.com/office/word/2018/wordml" xmlns:w16du="http://schemas.microsoft.com/office/word/2023/wordml/word16du" xmlns:w16sdtdh="http://schemas.microsoft.com/office/word/2020/wordml/sdtdatahash" xmlns:w16sdtfl="http://schemas.microsoft.com/office/word/2024/wordml/sdtformatlock" xmlns:w16se="http://schemas.microsoft.com/office/word/2015/wordml/symex" xmlns:wpg="http://schemas.microsoft.com/office/word/2010/wordprocessingGroup" xmlns:wpi="http://schemas.microsoft.com/office/word/2010/wordprocessingInk" xmlns:wne="http://schemas.microsoft.com/office/word/2006/wordml" xmlns:wps="http://schemas.microsoft.com/office/word/2010/wordprocessingShape" mc:Ignorable="w14 w15 w16se w16cid w16 w16cex w16sdtdh w16sdtfl w16du wp14">
+<w:document xmlns:wpc="http://schemas.microsoft.com/office/word/2010/wordprocessingCanvas" xmlns:cx="http://schemas.microsoft.com/office/drawing/2014/chartex" xmlns:cx1="http://schemas.microsoft.com/office/drawing/2015/9/8/chartex" xmlns:cx2="http://schemas.microsoft.com/office/drawing/2015/10/21/chartex" xmlns:cx3="http://schemas.microsoft.com/office/drawing/2016/5/9/chartex" xmlns:cx4="http://schemas.microsoft.com/office/drawing/2016/5/10/chartex" xmlns:cx5="http://schemas.microsoft.com/office/drawing/2016/5/11/chartex" xmlns:cx6="http://schemas.microsoft.com/office/drawing/2016/5/12/chartex" xmlns:cx7="http://schemas.microsoft.com/office/drawing/2016/5/13/chartex" xmlns:cx8="http://schemas.microsoft.com/office/drawing/2016/5/14/chartex" xmlns:mc="http://schemas.openxmlformats.org/markup-compatibility/2006" xmlns:aink="http://schemas.microsoft.com/office/drawing/2016/ink" xmlns:am3d="http://schemas.microsoft.com/office/drawing/2017/model3d" xmlns:o="urn:schemas-microsoft-com:office:office" xmlns:oel="http://schemas.microsoft.com/office/2019/extlst" xmlns:r="http://schemas.openxmlformats.org/officeDocument/2006/relationships" xmlns:m="http://schemas.openxmlformats.org/officeDocument/2006/math" xmlns:v="urn:schemas-microsoft-com:vml" xmlns:wp14="http://schemas.microsoft.com/office/word/2010/wordprocessingDrawing" xmlns:wp="http://schemas.openxmlformats.org/drawingml/2006/wordprocessingDrawing" xmlns:w10="urn:schemas-microsoft-com:office:word" xmlns:w="http://schemas.openxmlformats.org/wordprocessingml/2006/main" xmlns:w14="http://schemas.microsoft.com/office/word/2010/wordml" xmlns:w15="http://schemas.microsoft.com/office/word/2012/wordml" xmlns:w16cei="http://schemas.microsoft.com/office/word/2026/wordml/cei" xmlns:w16cex="http://schemas.microsoft.com/office/word/2018/wordml/cex" xmlns:w16cid="http://schemas.microsoft.com/office/word/2016/wordml/cid" xmlns:w16="http://schemas.microsoft.com/office/word/2018/wordml" xmlns:w16du="http://schemas.microsoft.com/office/word/2023/wordml/word16du" xmlns:w16sdtdh="http://schemas.microsoft.com/office/word/2020/wordml/sdtdatahash" xmlns:w16sdtfl="http://schemas.microsoft.com/office/word/2024/wordml/sdtformatlock" xmlns:w16se="http://schemas.microsoft.com/office/word/2015/wordml/symex" xmlns:wpg="http://schemas.microsoft.com/office/word/2010/wordprocessingGroup" xmlns:wpi="http://schemas.microsoft.com/office/word/2010/wordprocessingInk" xmlns:wne="http://schemas.microsoft.com/office/word/2006/wordml" xmlns:wps="http://schemas.microsoft.com/office/word/2010/wordprocessingShape" mc:Ignorable="w14 w15 w16se w16cid w16 w16cex w16sdtdh w16sdtfl w16du wp14">
   <w:body>
     <w:tbl>
       <w:tblPr>
@@ -435,7 +435,7 @@
           <w:b/>
           <w:bCs/>
         </w:rPr>
-        <w:t>4</w:t>
+        <w:t>6</w:t>
       </w:r>
     </w:p>
     <w:p>
@@ -766,7 +766,21 @@
         <w:rPr>
           <w:rFonts w:cstheme="minorHAnsi"/>
         </w:rPr>
-        <w:t>London and South East Region</w:t>
+        <w:t xml:space="preserve">London and </w:t>
+      </w:r>
+      <w:proofErr w:type="gramStart"/>
+      <w:r>
+        <w:rPr>
+          <w:rFonts w:cstheme="minorHAnsi"/>
+        </w:rPr>
+        <w:t>South East</w:t>
+      </w:r>
+      <w:proofErr w:type="gramEnd"/>
+      <w:r>
+        <w:rPr>
+          <w:rFonts w:cstheme="minorHAnsi"/>
+        </w:rPr>
+        <w:t xml:space="preserve"> Region</w:t>
       </w:r>
     </w:p>
     <w:sectPr>
@@ -786,7 +800,7 @@
 </file>
 
 <file path=word/endnotes.xml><?xml version="1.0" encoding="utf-8"?>
-<w:endnotes xmlns:wpc="http://schemas.microsoft.com/office/word/2010/wordprocessingCanvas" xmlns:cx="http://schemas.microsoft.com/office/drawing/2014/chartex" xmlns:cx1="http://schemas.microsoft.com/office/drawing/2015/9/8/chartex" xmlns:cx2="http://schemas.microsoft.com/office/drawing/2015/10/21/chartex" xmlns:cx3="http://schemas.microsoft.com/office/drawing/2016/5/9/chartex" xmlns:cx4="http://schemas.microsoft.com/office/drawing/2016/5/10/chartex" xmlns:cx5="http://schemas.microsoft.com/office/drawing/2016/5/11/chartex" xmlns:cx6="http://schemas.microsoft.com/office/drawing/2016/5/12/chartex" xmlns:cx7="http://schemas.microsoft.com/office/drawing/2016/5/13/chartex" xmlns:cx8="http://schemas.microsoft.com/office/drawing/2016/5/14/chartex" xmlns:mc="http://schemas.openxmlformats.org/markup-compatibility/2006" xmlns:aink="http://schemas.microsoft.com/office/drawing/2016/ink" xmlns:am3d="http://schemas.microsoft.com/office/drawing/2017/model3d" xmlns:o="urn:schemas-microsoft-com:office:office" xmlns:oel="http://schemas.microsoft.com/office/2019/extlst" xmlns:r="http://schemas.openxmlformats.org/officeDocument/2006/relationships" xmlns:m="http://schemas.openxmlformats.org/officeDocument/2006/math" xmlns:v="urn:schemas-microsoft-com:vml" xmlns:wp14="http://schemas.microsoft.com/office/word/2010/wordprocessingDrawing" xmlns:wp="http://schemas.openxmlformats.org/drawingml/2006/wordprocessingDrawing" xmlns:w10="urn:schemas-microsoft-com:office:word" xmlns:w="http://schemas.openxmlformats.org/wordprocessingml/2006/main" xmlns:w14="http://schemas.microsoft.com/office/word/2010/wordml" xmlns:w15="http://schemas.microsoft.com/office/word/2012/wordml" xmlns:w16cex="http://schemas.microsoft.com/office/word/2018/wordml/cex" xmlns:w16cid="http://schemas.microsoft.com/office/word/2016/wordml/cid" xmlns:w16="http://schemas.microsoft.com/office/word/2018/wordml" xmlns:w16du="http://schemas.microsoft.com/office/word/2023/wordml/word16du" xmlns:w16sdtdh="http://schemas.microsoft.com/office/word/2020/wordml/sdtdatahash" xmlns:w16sdtfl="http://schemas.microsoft.com/office/word/2024/wordml/sdtformatlock" xmlns:w16se="http://schemas.microsoft.com/office/word/2015/wordml/symex" xmlns:wpg="http://schemas.microsoft.com/office/word/2010/wordprocessingGroup" xmlns:wpi="http://schemas.microsoft.com/office/word/2010/wordprocessingInk" xmlns:wne="http://schemas.microsoft.com/office/word/2006/wordml" xmlns:wps="http://schemas.microsoft.com/office/word/2010/wordprocessingShape" mc:Ignorable="w14 w15 w16se w16cid w16 w16cex w16sdtdh w16sdtfl w16du wp14">
+<w:endnotes xmlns:wpc="http://schemas.microsoft.com/office/word/2010/wordprocessingCanvas" xmlns:cx="http://schemas.microsoft.com/office/drawing/2014/chartex" xmlns:cx1="http://schemas.microsoft.com/office/drawing/2015/9/8/chartex" xmlns:cx2="http://schemas.microsoft.com/office/drawing/2015/10/21/chartex" xmlns:cx3="http://schemas.microsoft.com/office/drawing/2016/5/9/chartex" xmlns:cx4="http://schemas.microsoft.com/office/drawing/2016/5/10/chartex" xmlns:cx5="http://schemas.microsoft.com/office/drawing/2016/5/11/chartex" xmlns:cx6="http://schemas.microsoft.com/office/drawing/2016/5/12/chartex" xmlns:cx7="http://schemas.microsoft.com/office/drawing/2016/5/13/chartex" xmlns:cx8="http://schemas.microsoft.com/office/drawing/2016/5/14/chartex" xmlns:mc="http://schemas.openxmlformats.org/markup-compatibility/2006" xmlns:aink="http://schemas.microsoft.com/office/drawing/2016/ink" xmlns:am3d="http://schemas.microsoft.com/office/drawing/2017/model3d" xmlns:o="urn:schemas-microsoft-com:office:office" xmlns:oel="http://schemas.microsoft.com/office/2019/extlst" xmlns:r="http://schemas.openxmlformats.org/officeDocument/2006/relationships" xmlns:m="http://schemas.openxmlformats.org/officeDocument/2006/math" xmlns:v="urn:schemas-microsoft-com:vml" xmlns:wp14="http://schemas.microsoft.com/office/word/2010/wordprocessingDrawing" xmlns:wp="http://schemas.openxmlformats.org/drawingml/2006/wordprocessingDrawing" xmlns:w10="urn:schemas-microsoft-com:office:word" xmlns:w="http://schemas.openxmlformats.org/wordprocessingml/2006/main" xmlns:w14="http://schemas.microsoft.com/office/word/2010/wordml" xmlns:w15="http://schemas.microsoft.com/office/word/2012/wordml" xmlns:w16cei="http://schemas.microsoft.com/office/word/2026/wordml/cei" xmlns:w16cex="http://schemas.microsoft.com/office/word/2018/wordml/cex" xmlns:w16cid="http://schemas.microsoft.com/office/word/2016/wordml/cid" xmlns:w16="http://schemas.microsoft.com/office/word/2018/wordml" xmlns:w16du="http://schemas.microsoft.com/office/word/2023/wordml/word16du" xmlns:w16sdtdh="http://schemas.microsoft.com/office/word/2020/wordml/sdtdatahash" xmlns:w16sdtfl="http://schemas.microsoft.com/office/word/2024/wordml/sdtformatlock" xmlns:w16se="http://schemas.microsoft.com/office/word/2015/wordml/symex" xmlns:wpg="http://schemas.microsoft.com/office/word/2010/wordprocessingGroup" xmlns:wpi="http://schemas.microsoft.com/office/word/2010/wordprocessingInk" xmlns:wne="http://schemas.microsoft.com/office/word/2006/wordml" xmlns:wps="http://schemas.microsoft.com/office/word/2010/wordprocessingShape" mc:Ignorable="w14 w15 w16se w16cid w16 w16cex w16sdtdh w16sdtfl w16du wp14">
   <w:endnote w:type="separator" w:id="-1">
     <w:p>
       <w:pPr>
@@ -811,7 +825,7 @@
 </file>
 
 <file path=word/footer1.xml><?xml version="1.0" encoding="utf-8"?>
-<w:ftr xmlns:wpc="http://schemas.microsoft.com/office/word/2010/wordprocessingCanvas" xmlns:cx="http://schemas.microsoft.com/office/drawing/2014/chartex" xmlns:cx1="http://schemas.microsoft.com/office/drawing/2015/9/8/chartex" xmlns:cx2="http://schemas.microsoft.com/office/drawing/2015/10/21/chartex" xmlns:cx3="http://schemas.microsoft.com/office/drawing/2016/5/9/chartex" xmlns:cx4="http://schemas.microsoft.com/office/drawing/2016/5/10/chartex" xmlns:cx5="http://schemas.microsoft.com/office/drawing/2016/5/11/chartex" xmlns:cx6="http://schemas.microsoft.com/office/drawing/2016/5/12/chartex" xmlns:cx7="http://schemas.microsoft.com/office/drawing/2016/5/13/chartex" xmlns:cx8="http://schemas.microsoft.com/office/drawing/2016/5/14/chartex" xmlns:mc="http://schemas.openxmlformats.org/markup-compatibility/2006" xmlns:aink="http://schemas.microsoft.com/office/drawing/2016/ink" xmlns:am3d="http://schemas.microsoft.com/office/drawing/2017/model3d" xmlns:o="urn:schemas-microsoft-com:office:office" xmlns:oel="http://schemas.microsoft.com/office/2019/extlst" xmlns:r="http://schemas.openxmlformats.org/officeDocument/2006/relationships" xmlns:m="http://schemas.openxmlformats.org/officeDocument/2006/math" xmlns:v="urn:schemas-microsoft-com:vml" xmlns:wp14="http://schemas.microsoft.com/office/word/2010/wordprocessingDrawing" xmlns:wp="http://schemas.openxmlformats.org/drawingml/2006/wordprocessingDrawing" xmlns:w10="urn:schemas-microsoft-com:office:word" xmlns:w="http://schemas.openxmlformats.org/wordprocessingml/2006/main" xmlns:w14="http://schemas.microsoft.com/office/word/2010/wordml" xmlns:w15="http://schemas.microsoft.com/office/word/2012/wordml" xmlns:w16cex="http://schemas.microsoft.com/office/word/2018/wordml/cex" xmlns:w16cid="http://schemas.microsoft.com/office/word/2016/wordml/cid" xmlns:w16="http://schemas.microsoft.com/office/word/2018/wordml" xmlns:w16du="http://schemas.microsoft.com/office/word/2023/wordml/word16du" xmlns:w16sdtdh="http://schemas.microsoft.com/office/word/2020/wordml/sdtdatahash" xmlns:w16sdtfl="http://schemas.microsoft.com/office/word/2024/wordml/sdtformatlock" xmlns:w16se="http://schemas.microsoft.com/office/word/2015/wordml/symex" xmlns:wpg="http://schemas.microsoft.com/office/word/2010/wordprocessingGroup" xmlns:wpi="http://schemas.microsoft.com/office/word/2010/wordprocessingInk" xmlns:wne="http://schemas.microsoft.com/office/word/2006/wordml" xmlns:wps="http://schemas.microsoft.com/office/word/2010/wordprocessingShape" mc:Ignorable="w14 w15 w16se w16cid w16 w16cex w16sdtdh w16sdtfl w16du wp14">
+<w:ftr xmlns:wpc="http://schemas.microsoft.com/office/word/2010/wordprocessingCanvas" xmlns:cx="http://schemas.microsoft.com/office/drawing/2014/chartex" xmlns:cx1="http://schemas.microsoft.com/office/drawing/2015/9/8/chartex" xmlns:cx2="http://schemas.microsoft.com/office/drawing/2015/10/21/chartex" xmlns:cx3="http://schemas.microsoft.com/office/drawing/2016/5/9/chartex" xmlns:cx4="http://schemas.microsoft.com/office/drawing/2016/5/10/chartex" xmlns:cx5="http://schemas.microsoft.com/office/drawing/2016/5/11/chartex" xmlns:cx6="http://schemas.microsoft.com/office/drawing/2016/5/12/chartex" xmlns:cx7="http://schemas.microsoft.com/office/drawing/2016/5/13/chartex" xmlns:cx8="http://schemas.microsoft.com/office/drawing/2016/5/14/chartex" xmlns:mc="http://schemas.openxmlformats.org/markup-compatibility/2006" xmlns:aink="http://schemas.microsoft.com/office/drawing/2016/ink" xmlns:am3d="http://schemas.microsoft.com/office/drawing/2017/model3d" xmlns:o="urn:schemas-microsoft-com:office:office" xmlns:oel="http://schemas.microsoft.com/office/2019/extlst" xmlns:r="http://schemas.openxmlformats.org/officeDocument/2006/relationships" xmlns:m="http://schemas.openxmlformats.org/officeDocument/2006/math" xmlns:v="urn:schemas-microsoft-com:vml" xmlns:wp14="http://schemas.microsoft.com/office/word/2010/wordprocessingDrawing" xmlns:wp="http://schemas.openxmlformats.org/drawingml/2006/wordprocessingDrawing" xmlns:w10="urn:schemas-microsoft-com:office:word" xmlns:w="http://schemas.openxmlformats.org/wordprocessingml/2006/main" xmlns:w14="http://schemas.microsoft.com/office/word/2010/wordml" xmlns:w15="http://schemas.microsoft.com/office/word/2012/wordml" xmlns:w16cei="http://schemas.microsoft.com/office/word/2026/wordml/cei" xmlns:w16cex="http://schemas.microsoft.com/office/word/2018/wordml/cex" xmlns:w16cid="http://schemas.microsoft.com/office/word/2016/wordml/cid" xmlns:w16="http://schemas.microsoft.com/office/word/2018/wordml" xmlns:w16du="http://schemas.microsoft.com/office/word/2023/wordml/word16du" xmlns:w16sdtdh="http://schemas.microsoft.com/office/word/2020/wordml/sdtdatahash" xmlns:w16sdtfl="http://schemas.microsoft.com/office/word/2024/wordml/sdtformatlock" xmlns:w16se="http://schemas.microsoft.com/office/word/2015/wordml/symex" xmlns:wpg="http://schemas.microsoft.com/office/word/2010/wordprocessingGroup" xmlns:wpi="http://schemas.microsoft.com/office/word/2010/wordprocessingInk" xmlns:wne="http://schemas.microsoft.com/office/word/2006/wordml" xmlns:wps="http://schemas.microsoft.com/office/word/2010/wordprocessingShape" mc:Ignorable="w14 w15 w16se w16cid w16 w16cex w16sdtdh w16sdtfl w16du wp14">
   <w:p>
     <w:pPr>
       <w:pStyle w:val="Footer"/>
@@ -821,7 +835,7 @@
 </file>
 
 <file path=word/footer2.xml><?xml version="1.0" encoding="utf-8"?>
-<w:ftr xmlns:wpc="http://schemas.microsoft.com/office/word/2010/wordprocessingCanvas" xmlns:cx="http://schemas.microsoft.com/office/drawing/2014/chartex" xmlns:cx1="http://schemas.microsoft.com/office/drawing/2015/9/8/chartex" xmlns:cx2="http://schemas.microsoft.com/office/drawing/2015/10/21/chartex" xmlns:cx3="http://schemas.microsoft.com/office/drawing/2016/5/9/chartex" xmlns:cx4="http://schemas.microsoft.com/office/drawing/2016/5/10/chartex" xmlns:cx5="http://schemas.microsoft.com/office/drawing/2016/5/11/chartex" xmlns:cx6="http://schemas.microsoft.com/office/drawing/2016/5/12/chartex" xmlns:cx7="http://schemas.microsoft.com/office/drawing/2016/5/13/chartex" xmlns:cx8="http://schemas.microsoft.com/office/drawing/2016/5/14/chartex" xmlns:mc="http://schemas.openxmlformats.org/markup-compatibility/2006" xmlns:aink="http://schemas.microsoft.com/office/drawing/2016/ink" xmlns:am3d="http://schemas.microsoft.com/office/drawing/2017/model3d" xmlns:o="urn:schemas-microsoft-com:office:office" xmlns:oel="http://schemas.microsoft.com/office/2019/extlst" xmlns:r="http://schemas.openxmlformats.org/officeDocument/2006/relationships" xmlns:m="http://schemas.openxmlformats.org/officeDocument/2006/math" xmlns:v="urn:schemas-microsoft-com:vml" xmlns:wp14="http://schemas.microsoft.com/office/word/2010/wordprocessingDrawing" xmlns:wp="http://schemas.openxmlformats.org/drawingml/2006/wordprocessingDrawing" xmlns:w10="urn:schemas-microsoft-com:office:word" xmlns:w="http://schemas.openxmlformats.org/wordprocessingml/2006/main" xmlns:w14="http://schemas.microsoft.com/office/word/2010/wordml" xmlns:w15="http://schemas.microsoft.com/office/word/2012/wordml" xmlns:w16cex="http://schemas.microsoft.com/office/word/2018/wordml/cex" xmlns:w16cid="http://schemas.microsoft.com/office/word/2016/wordml/cid" xmlns:w16="http://schemas.microsoft.com/office/word/2018/wordml" xmlns:w16du="http://schemas.microsoft.com/office/word/2023/wordml/word16du" xmlns:w16sdtdh="http://schemas.microsoft.com/office/word/2020/wordml/sdtdatahash" xmlns:w16sdtfl="http://schemas.microsoft.com/office/word/2024/wordml/sdtformatlock" xmlns:w16se="http://schemas.microsoft.com/office/word/2015/wordml/symex" xmlns:wpg="http://schemas.microsoft.com/office/word/2010/wordprocessingGroup" xmlns:wpi="http://schemas.microsoft.com/office/word/2010/wordprocessingInk" xmlns:wne="http://schemas.microsoft.com/office/word/2006/wordml" xmlns:wps="http://schemas.microsoft.com/office/word/2010/wordprocessingShape" mc:Ignorable="w14 w15 w16se w16cid w16 w16cex w16sdtdh w16sdtfl w16du wp14">
+<w:ftr xmlns:wpc="http://schemas.microsoft.com/office/word/2010/wordprocessingCanvas" xmlns:cx="http://schemas.microsoft.com/office/drawing/2014/chartex" xmlns:cx1="http://schemas.microsoft.com/office/drawing/2015/9/8/chartex" xmlns:cx2="http://schemas.microsoft.com/office/drawing/2015/10/21/chartex" xmlns:cx3="http://schemas.microsoft.com/office/drawing/2016/5/9/chartex" xmlns:cx4="http://schemas.microsoft.com/office/drawing/2016/5/10/chartex" xmlns:cx5="http://schemas.microsoft.com/office/drawing/2016/5/11/chartex" xmlns:cx6="http://schemas.microsoft.com/office/drawing/2016/5/12/chartex" xmlns:cx7="http://schemas.microsoft.com/office/drawing/2016/5/13/chartex" xmlns:cx8="http://schemas.microsoft.com/office/drawing/2016/5/14/chartex" xmlns:mc="http://schemas.openxmlformats.org/markup-compatibility/2006" xmlns:aink="http://schemas.microsoft.com/office/drawing/2016/ink" xmlns:am3d="http://schemas.microsoft.com/office/drawing/2017/model3d" xmlns:o="urn:schemas-microsoft-com:office:office" xmlns:oel="http://schemas.microsoft.com/office/2019/extlst" xmlns:r="http://schemas.openxmlformats.org/officeDocument/2006/relationships" xmlns:m="http://schemas.openxmlformats.org/officeDocument/2006/math" xmlns:v="urn:schemas-microsoft-com:vml" xmlns:wp14="http://schemas.microsoft.com/office/word/2010/wordprocessingDrawing" xmlns:wp="http://schemas.openxmlformats.org/drawingml/2006/wordprocessingDrawing" xmlns:w10="urn:schemas-microsoft-com:office:word" xmlns:w="http://schemas.openxmlformats.org/wordprocessingml/2006/main" xmlns:w14="http://schemas.microsoft.com/office/word/2010/wordml" xmlns:w15="http://schemas.microsoft.com/office/word/2012/wordml" xmlns:w16cei="http://schemas.microsoft.com/office/word/2026/wordml/cei" xmlns:w16cex="http://schemas.microsoft.com/office/word/2018/wordml/cex" xmlns:w16cid="http://schemas.microsoft.com/office/word/2016/wordml/cid" xmlns:w16="http://schemas.microsoft.com/office/word/2018/wordml" xmlns:w16du="http://schemas.microsoft.com/office/word/2023/wordml/word16du" xmlns:w16sdtdh="http://schemas.microsoft.com/office/word/2020/wordml/sdtdatahash" xmlns:w16sdtfl="http://schemas.microsoft.com/office/word/2024/wordml/sdtformatlock" xmlns:w16se="http://schemas.microsoft.com/office/word/2015/wordml/symex" xmlns:wpg="http://schemas.microsoft.com/office/word/2010/wordprocessingGroup" xmlns:wpi="http://schemas.microsoft.com/office/word/2010/wordprocessingInk" xmlns:wne="http://schemas.microsoft.com/office/word/2006/wordml" xmlns:wps="http://schemas.microsoft.com/office/word/2010/wordprocessingShape" mc:Ignorable="w14 w15 w16se w16cid w16 w16cex w16sdtdh w16sdtfl w16du wp14">
   <w:p>
     <w:pPr>
       <w:pStyle w:val="Footer"/>
@@ -1058,14 +1072,23 @@
         <w:sz w:val="16"/>
         <w:szCs w:val="16"/>
       </w:rPr>
-      <w:t>020 7973 3700</w:t>
+      <w:t xml:space="preserve">020 7973 </w:t>
     </w:r>
+    <w:proofErr w:type="gramStart"/>
     <w:r>
       <w:rPr>
         <w:rFonts w:ascii="Arial" w:hAnsi="Arial"/>
         <w:sz w:val="16"/>
         <w:szCs w:val="16"/>
       </w:rPr>
+      <w:t>3700</w:t>
+    </w:r>
+    <w:r>
+      <w:rPr>
+        <w:rFonts w:ascii="Arial" w:hAnsi="Arial"/>
+        <w:sz w:val="16"/>
+        <w:szCs w:val="16"/>
+      </w:rPr>
       <w:t xml:space="preserve">  </w:t>
     </w:r>
     <w:r>
@@ -1074,7 +1097,16 @@
         <w:sz w:val="16"/>
         <w:szCs w:val="16"/>
       </w:rPr>
-      <w:t xml:space="preserve">|  </w:t>
+      <w:t>|</w:t>
+    </w:r>
+    <w:proofErr w:type="gramEnd"/>
+    <w:r>
+      <w:rPr>
+        <w:rFonts w:ascii="Arial" w:hAnsi="Arial"/>
+        <w:sz w:val="16"/>
+        <w:szCs w:val="16"/>
+      </w:rPr>
+      <w:t xml:space="preserve">  </w:t>
     </w:r>
     <w:r>
       <w:rPr>
@@ -1149,7 +1181,7 @@
 </file>
 
 <file path=word/footer3.xml><?xml version="1.0" encoding="utf-8"?>
-<w:ftr xmlns:wpc="http://schemas.microsoft.com/office/word/2010/wordprocessingCanvas" xmlns:cx="http://schemas.microsoft.com/office/drawing/2014/chartex" xmlns:cx1="http://schemas.microsoft.com/office/drawing/2015/9/8/chartex" xmlns:cx2="http://schemas.microsoft.com/office/drawing/2015/10/21/chartex" xmlns:cx3="http://schemas.microsoft.com/office/drawing/2016/5/9/chartex" xmlns:cx4="http://schemas.microsoft.com/office/drawing/2016/5/10/chartex" xmlns:cx5="http://schemas.microsoft.com/office/drawing/2016/5/11/chartex" xmlns:cx6="http://schemas.microsoft.com/office/drawing/2016/5/12/chartex" xmlns:cx7="http://schemas.microsoft.com/office/drawing/2016/5/13/chartex" xmlns:cx8="http://schemas.microsoft.com/office/drawing/2016/5/14/chartex" xmlns:mc="http://schemas.openxmlformats.org/markup-compatibility/2006" xmlns:aink="http://schemas.microsoft.com/office/drawing/2016/ink" xmlns:am3d="http://schemas.microsoft.com/office/drawing/2017/model3d" xmlns:o="urn:schemas-microsoft-com:office:office" xmlns:oel="http://schemas.microsoft.com/office/2019/extlst" xmlns:r="http://schemas.openxmlformats.org/officeDocument/2006/relationships" xmlns:m="http://schemas.openxmlformats.org/officeDocument/2006/math" xmlns:v="urn:schemas-microsoft-com:vml" xmlns:wp14="http://schemas.microsoft.com/office/word/2010/wordprocessingDrawing" xmlns:wp="http://schemas.openxmlformats.org/drawingml/2006/wordprocessingDrawing" xmlns:w10="urn:schemas-microsoft-com:office:word" xmlns:w="http://schemas.openxmlformats.org/wordprocessingml/2006/main" xmlns:w14="http://schemas.microsoft.com/office/word/2010/wordml" xmlns:w15="http://schemas.microsoft.com/office/word/2012/wordml" xmlns:w16cex="http://schemas.microsoft.com/office/word/2018/wordml/cex" xmlns:w16cid="http://schemas.microsoft.com/office/word/2016/wordml/cid" xmlns:w16="http://schemas.microsoft.com/office/word/2018/wordml" xmlns:w16du="http://schemas.microsoft.com/office/word/2023/wordml/word16du" xmlns:w16sdtdh="http://schemas.microsoft.com/office/word/2020/wordml/sdtdatahash" xmlns:w16sdtfl="http://schemas.microsoft.com/office/word/2024/wordml/sdtformatlock" xmlns:w16se="http://schemas.microsoft.com/office/word/2015/wordml/symex" xmlns:wpg="http://schemas.microsoft.com/office/word/2010/wordprocessingGroup" xmlns:wpi="http://schemas.microsoft.com/office/word/2010/wordprocessingInk" xmlns:wne="http://schemas.microsoft.com/office/word/2006/wordml" xmlns:wps="http://schemas.microsoft.com/office/word/2010/wordprocessingShape" mc:Ignorable="w14 w15 w16se w16cid w16 w16cex w16sdtdh w16sdtfl w16du wp14">
+<w:ftr xmlns:wpc="http://schemas.microsoft.com/office/word/2010/wordprocessingCanvas" xmlns:cx="http://schemas.microsoft.com/office/drawing/2014/chartex" xmlns:cx1="http://schemas.microsoft.com/office/drawing/2015/9/8/chartex" xmlns:cx2="http://schemas.microsoft.com/office/drawing/2015/10/21/chartex" xmlns:cx3="http://schemas.microsoft.com/office/drawing/2016/5/9/chartex" xmlns:cx4="http://schemas.microsoft.com/office/drawing/2016/5/10/chartex" xmlns:cx5="http://schemas.microsoft.com/office/drawing/2016/5/11/chartex" xmlns:cx6="http://schemas.microsoft.com/office/drawing/2016/5/12/chartex" xmlns:cx7="http://schemas.microsoft.com/office/drawing/2016/5/13/chartex" xmlns:cx8="http://schemas.microsoft.com/office/drawing/2016/5/14/chartex" xmlns:mc="http://schemas.openxmlformats.org/markup-compatibility/2006" xmlns:aink="http://schemas.microsoft.com/office/drawing/2016/ink" xmlns:am3d="http://schemas.microsoft.com/office/drawing/2017/model3d" xmlns:o="urn:schemas-microsoft-com:office:office" xmlns:oel="http://schemas.microsoft.com/office/2019/extlst" xmlns:r="http://schemas.openxmlformats.org/officeDocument/2006/relationships" xmlns:m="http://schemas.openxmlformats.org/officeDocument/2006/math" xmlns:v="urn:schemas-microsoft-com:vml" xmlns:wp14="http://schemas.microsoft.com/office/word/2010/wordprocessingDrawing" xmlns:wp="http://schemas.openxmlformats.org/drawingml/2006/wordprocessingDrawing" xmlns:w10="urn:schemas-microsoft-com:office:word" xmlns:w="http://schemas.openxmlformats.org/wordprocessingml/2006/main" xmlns:w14="http://schemas.microsoft.com/office/word/2010/wordml" xmlns:w15="http://schemas.microsoft.com/office/word/2012/wordml" xmlns:w16cei="http://schemas.microsoft.com/office/word/2026/wordml/cei" xmlns:w16cex="http://schemas.microsoft.com/office/word/2018/wordml/cex" xmlns:w16cid="http://schemas.microsoft.com/office/word/2016/wordml/cid" xmlns:w16="http://schemas.microsoft.com/office/word/2018/wordml" xmlns:w16du="http://schemas.microsoft.com/office/word/2023/wordml/word16du" xmlns:w16sdtdh="http://schemas.microsoft.com/office/word/2020/wordml/sdtdatahash" xmlns:w16sdtfl="http://schemas.microsoft.com/office/word/2024/wordml/sdtformatlock" xmlns:w16se="http://schemas.microsoft.com/office/word/2015/wordml/symex" xmlns:wpg="http://schemas.microsoft.com/office/word/2010/wordprocessingGroup" xmlns:wpi="http://schemas.microsoft.com/office/word/2010/wordprocessingInk" xmlns:wne="http://schemas.microsoft.com/office/word/2006/wordml" xmlns:wps="http://schemas.microsoft.com/office/word/2010/wordprocessingShape" mc:Ignorable="w14 w15 w16se w16cid w16 w16cex w16sdtdh w16sdtfl w16du wp14">
   <w:p>
     <w:pPr>
       <w:pStyle w:val="Footer"/>
@@ -1159,7 +1191,7 @@
 </file>
 
 <file path=word/footnotes.xml><?xml version="1.0" encoding="utf-8"?>
-<w:footnotes xmlns:wpc="http://schemas.microsoft.com/office/word/2010/wordprocessingCanvas" xmlns:cx="http://schemas.microsoft.com/office/drawing/2014/chartex" xmlns:cx1="http://schemas.microsoft.com/office/drawing/2015/9/8/chartex" xmlns:cx2="http://schemas.microsoft.com/office/drawing/2015/10/21/chartex" xmlns:cx3="http://schemas.microsoft.com/office/drawing/2016/5/9/chartex" xmlns:cx4="http://schemas.microsoft.com/office/drawing/2016/5/10/chartex" xmlns:cx5="http://schemas.microsoft.com/office/drawing/2016/5/11/chartex" xmlns:cx6="http://schemas.microsoft.com/office/drawing/2016/5/12/chartex" xmlns:cx7="http://schemas.microsoft.com/office/drawing/2016/5/13/chartex" xmlns:cx8="http://schemas.microsoft.com/office/drawing/2016/5/14/chartex" xmlns:mc="http://schemas.openxmlformats.org/markup-compatibility/2006" xmlns:aink="http://schemas.microsoft.com/office/drawing/2016/ink" xmlns:am3d="http://schemas.microsoft.com/office/drawing/2017/model3d" xmlns:o="urn:schemas-microsoft-com:office:office" xmlns:oel="http://schemas.microsoft.com/office/2019/extlst" xmlns:r="http://schemas.openxmlformats.org/officeDocument/2006/relationships" xmlns:m="http://schemas.openxmlformats.org/officeDocument/2006/math" xmlns:v="urn:schemas-microsoft-com:vml" xmlns:wp14="http://schemas.microsoft.com/office/word/2010/wordprocessingDrawing" xmlns:wp="http://schemas.openxmlformats.org/drawingml/2006/wordprocessingDrawing" xmlns:w10="urn:schemas-microsoft-com:office:word" xmlns:w="http://schemas.openxmlformats.org/wordprocessingml/2006/main" xmlns:w14="http://schemas.microsoft.com/office/word/2010/wordml" xmlns:w15="http://schemas.microsoft.com/office/word/2012/wordml" xmlns:w16cex="http://schemas.microsoft.com/office/word/2018/wordml/cex" xmlns:w16cid="http://schemas.microsoft.com/office/word/2016/wordml/cid" xmlns:w16="http://schemas.microsoft.com/office/word/2018/wordml" xmlns:w16du="http://schemas.microsoft.com/office/word/2023/wordml/word16du" xmlns:w16sdtdh="http://schemas.microsoft.com/office/word/2020/wordml/sdtdatahash" xmlns:w16sdtfl="http://schemas.microsoft.com/office/word/2024/wordml/sdtformatlock" xmlns:w16se="http://schemas.microsoft.com/office/word/2015/wordml/symex" xmlns:wpg="http://schemas.microsoft.com/office/word/2010/wordprocessingGroup" xmlns:wpi="http://schemas.microsoft.com/office/word/2010/wordprocessingInk" xmlns:wne="http://schemas.microsoft.com/office/word/2006/wordml" xmlns:wps="http://schemas.microsoft.com/office/word/2010/wordprocessingShape" mc:Ignorable="w14 w15 w16se w16cid w16 w16cex w16sdtdh w16sdtfl w16du wp14">
+<w:footnotes xmlns:wpc="http://schemas.microsoft.com/office/word/2010/wordprocessingCanvas" xmlns:cx="http://schemas.microsoft.com/office/drawing/2014/chartex" xmlns:cx1="http://schemas.microsoft.com/office/drawing/2015/9/8/chartex" xmlns:cx2="http://schemas.microsoft.com/office/drawing/2015/10/21/chartex" xmlns:cx3="http://schemas.microsoft.com/office/drawing/2016/5/9/chartex" xmlns:cx4="http://schemas.microsoft.com/office/drawing/2016/5/10/chartex" xmlns:cx5="http://schemas.microsoft.com/office/drawing/2016/5/11/chartex" xmlns:cx6="http://schemas.microsoft.com/office/drawing/2016/5/12/chartex" xmlns:cx7="http://schemas.microsoft.com/office/drawing/2016/5/13/chartex" xmlns:cx8="http://schemas.microsoft.com/office/drawing/2016/5/14/chartex" xmlns:mc="http://schemas.openxmlformats.org/markup-compatibility/2006" xmlns:aink="http://schemas.microsoft.com/office/drawing/2016/ink" xmlns:am3d="http://schemas.microsoft.com/office/drawing/2017/model3d" xmlns:o="urn:schemas-microsoft-com:office:office" xmlns:oel="http://schemas.microsoft.com/office/2019/extlst" xmlns:r="http://schemas.openxmlformats.org/officeDocument/2006/relationships" xmlns:m="http://schemas.openxmlformats.org/officeDocument/2006/math" xmlns:v="urn:schemas-microsoft-com:vml" xmlns:wp14="http://schemas.microsoft.com/office/word/2010/wordprocessingDrawing" xmlns:wp="http://schemas.openxmlformats.org/drawingml/2006/wordprocessingDrawing" xmlns:w10="urn:schemas-microsoft-com:office:word" xmlns:w="http://schemas.openxmlformats.org/wordprocessingml/2006/main" xmlns:w14="http://schemas.microsoft.com/office/word/2010/wordml" xmlns:w15="http://schemas.microsoft.com/office/word/2012/wordml" xmlns:w16cei="http://schemas.microsoft.com/office/word/2026/wordml/cei" xmlns:w16cex="http://schemas.microsoft.com/office/word/2018/wordml/cex" xmlns:w16cid="http://schemas.microsoft.com/office/word/2016/wordml/cid" xmlns:w16="http://schemas.microsoft.com/office/word/2018/wordml" xmlns:w16du="http://schemas.microsoft.com/office/word/2023/wordml/word16du" xmlns:w16sdtdh="http://schemas.microsoft.com/office/word/2020/wordml/sdtdatahash" xmlns:w16sdtfl="http://schemas.microsoft.com/office/word/2024/wordml/sdtformatlock" xmlns:w16se="http://schemas.microsoft.com/office/word/2015/wordml/symex" xmlns:wpg="http://schemas.microsoft.com/office/word/2010/wordprocessingGroup" xmlns:wpi="http://schemas.microsoft.com/office/word/2010/wordprocessingInk" xmlns:wne="http://schemas.microsoft.com/office/word/2006/wordml" xmlns:wps="http://schemas.microsoft.com/office/word/2010/wordprocessingShape" mc:Ignorable="w14 w15 w16se w16cid w16 w16cex w16sdtdh w16sdtfl w16du wp14">
   <w:footnote w:type="separator" w:id="-1">
     <w:p>
       <w:pPr>
@@ -1184,7 +1216,7 @@
 </file>
 
 <file path=word/header1.xml><?xml version="1.0" encoding="utf-8"?>
-<w:hdr xmlns:wpc="http://schemas.microsoft.com/office/word/2010/wordprocessingCanvas" xmlns:cx="http://schemas.microsoft.com/office/drawing/2014/chartex" xmlns:cx1="http://schemas.microsoft.com/office/drawing/2015/9/8/chartex" xmlns:cx2="http://schemas.microsoft.com/office/drawing/2015/10/21/chartex" xmlns:cx3="http://schemas.microsoft.com/office/drawing/2016/5/9/chartex" xmlns:cx4="http://schemas.microsoft.com/office/drawing/2016/5/10/chartex" xmlns:cx5="http://schemas.microsoft.com/office/drawing/2016/5/11/chartex" xmlns:cx6="http://schemas.microsoft.com/office/drawing/2016/5/12/chartex" xmlns:cx7="http://schemas.microsoft.com/office/drawing/2016/5/13/chartex" xmlns:cx8="http://schemas.microsoft.com/office/drawing/2016/5/14/chartex" xmlns:mc="http://schemas.openxmlformats.org/markup-compatibility/2006" xmlns:aink="http://schemas.microsoft.com/office/drawing/2016/ink" xmlns:am3d="http://schemas.microsoft.com/office/drawing/2017/model3d" xmlns:o="urn:schemas-microsoft-com:office:office" xmlns:oel="http://schemas.microsoft.com/office/2019/extlst" xmlns:r="http://schemas.openxmlformats.org/officeDocument/2006/relationships" xmlns:m="http://schemas.openxmlformats.org/officeDocument/2006/math" xmlns:v="urn:schemas-microsoft-com:vml" xmlns:wp14="http://schemas.microsoft.com/office/word/2010/wordprocessingDrawing" xmlns:wp="http://schemas.openxmlformats.org/drawingml/2006/wordprocessingDrawing" xmlns:w10="urn:schemas-microsoft-com:office:word" xmlns:w="http://schemas.openxmlformats.org/wordprocessingml/2006/main" xmlns:w14="http://schemas.microsoft.com/office/word/2010/wordml" xmlns:w15="http://schemas.microsoft.com/office/word/2012/wordml" xmlns:w16cex="http://schemas.microsoft.com/office/word/2018/wordml/cex" xmlns:w16cid="http://schemas.microsoft.com/office/word/2016/wordml/cid" xmlns:w16="http://schemas.microsoft.com/office/word/2018/wordml" xmlns:w16du="http://schemas.microsoft.com/office/word/2023/wordml/word16du" xmlns:w16sdtdh="http://schemas.microsoft.com/office/word/2020/wordml/sdtdatahash" xmlns:w16sdtfl="http://schemas.microsoft.com/office/word/2024/wordml/sdtformatlock" xmlns:w16se="http://schemas.microsoft.com/office/word/2015/wordml/symex" xmlns:wpg="http://schemas.microsoft.com/office/word/2010/wordprocessingGroup" xmlns:wpi="http://schemas.microsoft.com/office/word/2010/wordprocessingInk" xmlns:wne="http://schemas.microsoft.com/office/word/2006/wordml" xmlns:wps="http://schemas.microsoft.com/office/word/2010/wordprocessingShape" mc:Ignorable="w14 w15 w16se w16cid w16 w16cex w16sdtdh w16sdtfl w16du wp14">
+<w:hdr xmlns:wpc="http://schemas.microsoft.com/office/word/2010/wordprocessingCanvas" xmlns:cx="http://schemas.microsoft.com/office/drawing/2014/chartex" xmlns:cx1="http://schemas.microsoft.com/office/drawing/2015/9/8/chartex" xmlns:cx2="http://schemas.microsoft.com/office/drawing/2015/10/21/chartex" xmlns:cx3="http://schemas.microsoft.com/office/drawing/2016/5/9/chartex" xmlns:cx4="http://schemas.microsoft.com/office/drawing/2016/5/10/chartex" xmlns:cx5="http://schemas.microsoft.com/office/drawing/2016/5/11/chartex" xmlns:cx6="http://schemas.microsoft.com/office/drawing/2016/5/12/chartex" xmlns:cx7="http://schemas.microsoft.com/office/drawing/2016/5/13/chartex" xmlns:cx8="http://schemas.microsoft.com/office/drawing/2016/5/14/chartex" xmlns:mc="http://schemas.openxmlformats.org/markup-compatibility/2006" xmlns:aink="http://schemas.microsoft.com/office/drawing/2016/ink" xmlns:am3d="http://schemas.microsoft.com/office/drawing/2017/model3d" xmlns:o="urn:schemas-microsoft-com:office:office" xmlns:oel="http://schemas.microsoft.com/office/2019/extlst" xmlns:r="http://schemas.openxmlformats.org/officeDocument/2006/relationships" xmlns:m="http://schemas.openxmlformats.org/officeDocument/2006/math" xmlns:v="urn:schemas-microsoft-com:vml" xmlns:wp14="http://schemas.microsoft.com/office/word/2010/wordprocessingDrawing" xmlns:wp="http://schemas.openxmlformats.org/drawingml/2006/wordprocessingDrawing" xmlns:w10="urn:schemas-microsoft-com:office:word" xmlns:w="http://schemas.openxmlformats.org/wordprocessingml/2006/main" xmlns:w14="http://schemas.microsoft.com/office/word/2010/wordml" xmlns:w15="http://schemas.microsoft.com/office/word/2012/wordml" xmlns:w16cei="http://schemas.microsoft.com/office/word/2026/wordml/cei" xmlns:w16cex="http://schemas.microsoft.com/office/word/2018/wordml/cex" xmlns:w16cid="http://schemas.microsoft.com/office/word/2016/wordml/cid" xmlns:w16="http://schemas.microsoft.com/office/word/2018/wordml" xmlns:w16du="http://schemas.microsoft.com/office/word/2023/wordml/word16du" xmlns:w16sdtdh="http://schemas.microsoft.com/office/word/2020/wordml/sdtdatahash" xmlns:w16sdtfl="http://schemas.microsoft.com/office/word/2024/wordml/sdtformatlock" xmlns:w16se="http://schemas.microsoft.com/office/word/2015/wordml/symex" xmlns:wpg="http://schemas.microsoft.com/office/word/2010/wordprocessingGroup" xmlns:wpi="http://schemas.microsoft.com/office/word/2010/wordprocessingInk" xmlns:wne="http://schemas.microsoft.com/office/word/2006/wordml" xmlns:wps="http://schemas.microsoft.com/office/word/2010/wordprocessingShape" mc:Ignorable="w14 w15 w16se w16cid w16 w16cex w16sdtdh w16sdtfl w16du wp14">
   <w:p>
     <w:pPr>
       <w:pStyle w:val="Header"/>
@@ -1194,7 +1226,7 @@
 </file>
 
 <file path=word/header2.xml><?xml version="1.0" encoding="utf-8"?>
-<w:hdr xmlns:wpc="http://schemas.microsoft.com/office/word/2010/wordprocessingCanvas" xmlns:cx="http://schemas.microsoft.com/office/drawing/2014/chartex" xmlns:cx1="http://schemas.microsoft.com/office/drawing/2015/9/8/chartex" xmlns:cx2="http://schemas.microsoft.com/office/drawing/2015/10/21/chartex" xmlns:cx3="http://schemas.microsoft.com/office/drawing/2016/5/9/chartex" xmlns:cx4="http://schemas.microsoft.com/office/drawing/2016/5/10/chartex" xmlns:cx5="http://schemas.microsoft.com/office/drawing/2016/5/11/chartex" xmlns:cx6="http://schemas.microsoft.com/office/drawing/2016/5/12/chartex" xmlns:cx7="http://schemas.microsoft.com/office/drawing/2016/5/13/chartex" xmlns:cx8="http://schemas.microsoft.com/office/drawing/2016/5/14/chartex" xmlns:mc="http://schemas.openxmlformats.org/markup-compatibility/2006" xmlns:aink="http://schemas.microsoft.com/office/drawing/2016/ink" xmlns:am3d="http://schemas.microsoft.com/office/drawing/2017/model3d" xmlns:o="urn:schemas-microsoft-com:office:office" xmlns:oel="http://schemas.microsoft.com/office/2019/extlst" xmlns:r="http://schemas.openxmlformats.org/officeDocument/2006/relationships" xmlns:m="http://schemas.openxmlformats.org/officeDocument/2006/math" xmlns:v="urn:schemas-microsoft-com:vml" xmlns:wp14="http://schemas.microsoft.com/office/word/2010/wordprocessingDrawing" xmlns:wp="http://schemas.openxmlformats.org/drawingml/2006/wordprocessingDrawing" xmlns:w10="urn:schemas-microsoft-com:office:word" xmlns:w="http://schemas.openxmlformats.org/wordprocessingml/2006/main" xmlns:w14="http://schemas.microsoft.com/office/word/2010/wordml" xmlns:w15="http://schemas.microsoft.com/office/word/2012/wordml" xmlns:w16cex="http://schemas.microsoft.com/office/word/2018/wordml/cex" xmlns:w16cid="http://schemas.microsoft.com/office/word/2016/wordml/cid" xmlns:w16="http://schemas.microsoft.com/office/word/2018/wordml" xmlns:w16du="http://schemas.microsoft.com/office/word/2023/wordml/word16du" xmlns:w16sdtdh="http://schemas.microsoft.com/office/word/2020/wordml/sdtdatahash" xmlns:w16sdtfl="http://schemas.microsoft.com/office/word/2024/wordml/sdtformatlock" xmlns:w16se="http://schemas.microsoft.com/office/word/2015/wordml/symex" xmlns:wpg="http://schemas.microsoft.com/office/word/2010/wordprocessingGroup" xmlns:wpi="http://schemas.microsoft.com/office/word/2010/wordprocessingInk" xmlns:wne="http://schemas.microsoft.com/office/word/2006/wordml" xmlns:wps="http://schemas.microsoft.com/office/word/2010/wordprocessingShape" mc:Ignorable="w14 w15 w16se w16cid w16 w16cex w16sdtdh w16sdtfl w16du wp14">
+<w:hdr xmlns:wpc="http://schemas.microsoft.com/office/word/2010/wordprocessingCanvas" xmlns:cx="http://schemas.microsoft.com/office/drawing/2014/chartex" xmlns:cx1="http://schemas.microsoft.com/office/drawing/2015/9/8/chartex" xmlns:cx2="http://schemas.microsoft.com/office/drawing/2015/10/21/chartex" xmlns:cx3="http://schemas.microsoft.com/office/drawing/2016/5/9/chartex" xmlns:cx4="http://schemas.microsoft.com/office/drawing/2016/5/10/chartex" xmlns:cx5="http://schemas.microsoft.com/office/drawing/2016/5/11/chartex" xmlns:cx6="http://schemas.microsoft.com/office/drawing/2016/5/12/chartex" xmlns:cx7="http://schemas.microsoft.com/office/drawing/2016/5/13/chartex" xmlns:cx8="http://schemas.microsoft.com/office/drawing/2016/5/14/chartex" xmlns:mc="http://schemas.openxmlformats.org/markup-compatibility/2006" xmlns:aink="http://schemas.microsoft.com/office/drawing/2016/ink" xmlns:am3d="http://schemas.microsoft.com/office/drawing/2017/model3d" xmlns:o="urn:schemas-microsoft-com:office:office" xmlns:oel="http://schemas.microsoft.com/office/2019/extlst" xmlns:r="http://schemas.openxmlformats.org/officeDocument/2006/relationships" xmlns:m="http://schemas.openxmlformats.org/officeDocument/2006/math" xmlns:v="urn:schemas-microsoft-com:vml" xmlns:wp14="http://schemas.microsoft.com/office/word/2010/wordprocessingDrawing" xmlns:wp="http://schemas.openxmlformats.org/drawingml/2006/wordprocessingDrawing" xmlns:w10="urn:schemas-microsoft-com:office:word" xmlns:w="http://schemas.openxmlformats.org/wordprocessingml/2006/main" xmlns:w14="http://schemas.microsoft.com/office/word/2010/wordml" xmlns:w15="http://schemas.microsoft.com/office/word/2012/wordml" xmlns:w16cei="http://schemas.microsoft.com/office/word/2026/wordml/cei" xmlns:w16cex="http://schemas.microsoft.com/office/word/2018/wordml/cex" xmlns:w16cid="http://schemas.microsoft.com/office/word/2016/wordml/cid" xmlns:w16="http://schemas.microsoft.com/office/word/2018/wordml" xmlns:w16du="http://schemas.microsoft.com/office/word/2023/wordml/word16du" xmlns:w16sdtdh="http://schemas.microsoft.com/office/word/2020/wordml/sdtdatahash" xmlns:w16sdtfl="http://schemas.microsoft.com/office/word/2024/wordml/sdtformatlock" xmlns:w16se="http://schemas.microsoft.com/office/word/2015/wordml/symex" xmlns:wpg="http://schemas.microsoft.com/office/word/2010/wordprocessingGroup" xmlns:wpi="http://schemas.microsoft.com/office/word/2010/wordprocessingInk" xmlns:wne="http://schemas.microsoft.com/office/word/2006/wordml" xmlns:wps="http://schemas.microsoft.com/office/word/2010/wordprocessingShape" mc:Ignorable="w14 w15 w16se w16cid w16 w16cex w16sdtdh w16sdtfl w16du wp14">
   <w:p>
     <w:pPr>
       <w:pStyle w:val="Header"/>
@@ -1278,7 +1310,7 @@
 </file>
 
 <file path=word/header3.xml><?xml version="1.0" encoding="utf-8"?>
-<w:hdr xmlns:wpc="http://schemas.microsoft.com/office/word/2010/wordprocessingCanvas" xmlns:cx="http://schemas.microsoft.com/office/drawing/2014/chartex" xmlns:cx1="http://schemas.microsoft.com/office/drawing/2015/9/8/chartex" xmlns:cx2="http://schemas.microsoft.com/office/drawing/2015/10/21/chartex" xmlns:cx3="http://schemas.microsoft.com/office/drawing/2016/5/9/chartex" xmlns:cx4="http://schemas.microsoft.com/office/drawing/2016/5/10/chartex" xmlns:cx5="http://schemas.microsoft.com/office/drawing/2016/5/11/chartex" xmlns:cx6="http://schemas.microsoft.com/office/drawing/2016/5/12/chartex" xmlns:cx7="http://schemas.microsoft.com/office/drawing/2016/5/13/chartex" xmlns:cx8="http://schemas.microsoft.com/office/drawing/2016/5/14/chartex" xmlns:mc="http://schemas.openxmlformats.org/markup-compatibility/2006" xmlns:aink="http://schemas.microsoft.com/office/drawing/2016/ink" xmlns:am3d="http://schemas.microsoft.com/office/drawing/2017/model3d" xmlns:o="urn:schemas-microsoft-com:office:office" xmlns:oel="http://schemas.microsoft.com/office/2019/extlst" xmlns:r="http://schemas.openxmlformats.org/officeDocument/2006/relationships" xmlns:m="http://schemas.openxmlformats.org/officeDocument/2006/math" xmlns:v="urn:schemas-microsoft-com:vml" xmlns:wp14="http://schemas.microsoft.com/office/word/2010/wordprocessingDrawing" xmlns:wp="http://schemas.openxmlformats.org/drawingml/2006/wordprocessingDrawing" xmlns:w10="urn:schemas-microsoft-com:office:word" xmlns:w="http://schemas.openxmlformats.org/wordprocessingml/2006/main" xmlns:w14="http://schemas.microsoft.com/office/word/2010/wordml" xmlns:w15="http://schemas.microsoft.com/office/word/2012/wordml" xmlns:w16cex="http://schemas.microsoft.com/office/word/2018/wordml/cex" xmlns:w16cid="http://schemas.microsoft.com/office/word/2016/wordml/cid" xmlns:w16="http://schemas.microsoft.com/office/word/2018/wordml" xmlns:w16du="http://schemas.microsoft.com/office/word/2023/wordml/word16du" xmlns:w16sdtdh="http://schemas.microsoft.com/office/word/2020/wordml/sdtdatahash" xmlns:w16sdtfl="http://schemas.microsoft.com/office/word/2024/wordml/sdtformatlock" xmlns:w16se="http://schemas.microsoft.com/office/word/2015/wordml/symex" xmlns:wpg="http://schemas.microsoft.com/office/word/2010/wordprocessingGroup" xmlns:wpi="http://schemas.microsoft.com/office/word/2010/wordprocessingInk" xmlns:wne="http://schemas.microsoft.com/office/word/2006/wordml" xmlns:wps="http://schemas.microsoft.com/office/word/2010/wordprocessingShape" mc:Ignorable="w14 w15 w16se w16cid w16 w16cex w16sdtdh w16sdtfl w16du wp14">
+<w:hdr xmlns:wpc="http://schemas.microsoft.com/office/word/2010/wordprocessingCanvas" xmlns:cx="http://schemas.microsoft.com/office/drawing/2014/chartex" xmlns:cx1="http://schemas.microsoft.com/office/drawing/2015/9/8/chartex" xmlns:cx2="http://schemas.microsoft.com/office/drawing/2015/10/21/chartex" xmlns:cx3="http://schemas.microsoft.com/office/drawing/2016/5/9/chartex" xmlns:cx4="http://schemas.microsoft.com/office/drawing/2016/5/10/chartex" xmlns:cx5="http://schemas.microsoft.com/office/drawing/2016/5/11/chartex" xmlns:cx6="http://schemas.microsoft.com/office/drawing/2016/5/12/chartex" xmlns:cx7="http://schemas.microsoft.com/office/drawing/2016/5/13/chartex" xmlns:cx8="http://schemas.microsoft.com/office/drawing/2016/5/14/chartex" xmlns:mc="http://schemas.openxmlformats.org/markup-compatibility/2006" xmlns:aink="http://schemas.microsoft.com/office/drawing/2016/ink" xmlns:am3d="http://schemas.microsoft.com/office/drawing/2017/model3d" xmlns:o="urn:schemas-microsoft-com:office:office" xmlns:oel="http://schemas.microsoft.com/office/2019/extlst" xmlns:r="http://schemas.openxmlformats.org/officeDocument/2006/relationships" xmlns:m="http://schemas.openxmlformats.org/officeDocument/2006/math" xmlns:v="urn:schemas-microsoft-com:vml" xmlns:wp14="http://schemas.microsoft.com/office/word/2010/wordprocessingDrawing" xmlns:wp="http://schemas.openxmlformats.org/drawingml/2006/wordprocessingDrawing" xmlns:w10="urn:schemas-microsoft-com:office:word" xmlns:w="http://schemas.openxmlformats.org/wordprocessingml/2006/main" xmlns:w14="http://schemas.microsoft.com/office/word/2010/wordml" xmlns:w15="http://schemas.microsoft.com/office/word/2012/wordml" xmlns:w16cei="http://schemas.microsoft.com/office/word/2026/wordml/cei" xmlns:w16cex="http://schemas.microsoft.com/office/word/2018/wordml/cex" xmlns:w16cid="http://schemas.microsoft.com/office/word/2016/wordml/cid" xmlns:w16="http://schemas.microsoft.com/office/word/2018/wordml" xmlns:w16du="http://schemas.microsoft.com/office/word/2023/wordml/word16du" xmlns:w16sdtdh="http://schemas.microsoft.com/office/word/2020/wordml/sdtdatahash" xmlns:w16sdtfl="http://schemas.microsoft.com/office/word/2024/wordml/sdtformatlock" xmlns:w16se="http://schemas.microsoft.com/office/word/2015/wordml/symex" xmlns:wpg="http://schemas.microsoft.com/office/word/2010/wordprocessingGroup" xmlns:wpi="http://schemas.microsoft.com/office/word/2010/wordprocessingInk" xmlns:wne="http://schemas.microsoft.com/office/word/2006/wordml" xmlns:wps="http://schemas.microsoft.com/office/word/2010/wordprocessingShape" mc:Ignorable="w14 w15 w16se w16cid w16 w16cex w16sdtdh w16sdtfl w16du wp14">
   <w:p>
     <w:pPr>
       <w:pStyle w:val="Header"/>
@@ -1288,7 +1320,7 @@
 </file>
 
 <file path=word/numbering.xml><?xml version="1.0" encoding="utf-8"?>
-<w:numbering xmlns:wpc="http://schemas.microsoft.com/office/word/2010/wordprocessingCanvas" xmlns:cx="http://schemas.microsoft.com/office/drawing/2014/chartex" xmlns:cx1="http://schemas.microsoft.com/office/drawing/2015/9/8/chartex" xmlns:cx2="http://schemas.microsoft.com/office/drawing/2015/10/21/chartex" xmlns:cx3="http://schemas.microsoft.com/office/drawing/2016/5/9/chartex" xmlns:cx4="http://schemas.microsoft.com/office/drawing/2016/5/10/chartex" xmlns:cx5="http://schemas.microsoft.com/office/drawing/2016/5/11/chartex" xmlns:cx6="http://schemas.microsoft.com/office/drawing/2016/5/12/chartex" xmlns:cx7="http://schemas.microsoft.com/office/drawing/2016/5/13/chartex" xmlns:cx8="http://schemas.microsoft.com/office/drawing/2016/5/14/chartex" xmlns:mc="http://schemas.openxmlformats.org/markup-compatibility/2006" xmlns:aink="http://schemas.microsoft.com/office/drawing/2016/ink" xmlns:am3d="http://schemas.microsoft.com/office/drawing/2017/model3d" xmlns:o="urn:schemas-microsoft-com:office:office" xmlns:oel="http://schemas.microsoft.com/office/2019/extlst" xmlns:r="http://schemas.openxmlformats.org/officeDocument/2006/relationships" xmlns:m="http://schemas.openxmlformats.org/officeDocument/2006/math" xmlns:v="urn:schemas-microsoft-com:vml" xmlns:wp14="http://schemas.microsoft.com/office/word/2010/wordprocessingDrawing" xmlns:wp="http://schemas.openxmlformats.org/drawingml/2006/wordprocessingDrawing" xmlns:w10="urn:schemas-microsoft-com:office:word" xmlns:w="http://schemas.openxmlformats.org/wordprocessingml/2006/main" xmlns:w14="http://schemas.microsoft.com/office/word/2010/wordml" xmlns:w15="http://schemas.microsoft.com/office/word/2012/wordml" xmlns:w16cex="http://schemas.microsoft.com/office/word/2018/wordml/cex" xmlns:w16cid="http://schemas.microsoft.com/office/word/2016/wordml/cid" xmlns:w16="http://schemas.microsoft.com/office/word/2018/wordml" xmlns:w16du="http://schemas.microsoft.com/office/word/2023/wordml/word16du" xmlns:w16sdtdh="http://schemas.microsoft.com/office/word/2020/wordml/sdtdatahash" xmlns:w16sdtfl="http://schemas.microsoft.com/office/word/2024/wordml/sdtformatlock" xmlns:w16se="http://schemas.microsoft.com/office/word/2015/wordml/symex" xmlns:wpg="http://schemas.microsoft.com/office/word/2010/wordprocessingGroup" xmlns:wpi="http://schemas.microsoft.com/office/word/2010/wordprocessingInk" xmlns:wne="http://schemas.microsoft.com/office/word/2006/wordml" xmlns:wps="http://schemas.microsoft.com/office/word/2010/wordprocessingShape" mc:Ignorable="w14 w15 w16se w16cid w16 w16cex w16sdtdh w16sdtfl w16du wp14">
+<w:numbering xmlns:wpc="http://schemas.microsoft.com/office/word/2010/wordprocessingCanvas" xmlns:cx="http://schemas.microsoft.com/office/drawing/2014/chartex" xmlns:cx1="http://schemas.microsoft.com/office/drawing/2015/9/8/chartex" xmlns:cx2="http://schemas.microsoft.com/office/drawing/2015/10/21/chartex" xmlns:cx3="http://schemas.microsoft.com/office/drawing/2016/5/9/chartex" xmlns:cx4="http://schemas.microsoft.com/office/drawing/2016/5/10/chartex" xmlns:cx5="http://schemas.microsoft.com/office/drawing/2016/5/11/chartex" xmlns:cx6="http://schemas.microsoft.com/office/drawing/2016/5/12/chartex" xmlns:cx7="http://schemas.microsoft.com/office/drawing/2016/5/13/chartex" xmlns:cx8="http://schemas.microsoft.com/office/drawing/2016/5/14/chartex" xmlns:mc="http://schemas.openxmlformats.org/markup-compatibility/2006" xmlns:aink="http://schemas.microsoft.com/office/drawing/2016/ink" xmlns:am3d="http://schemas.microsoft.com/office/drawing/2017/model3d" xmlns:o="urn:schemas-microsoft-com:office:office" xmlns:oel="http://schemas.microsoft.com/office/2019/extlst" xmlns:r="http://schemas.openxmlformats.org/officeDocument/2006/relationships" xmlns:m="http://schemas.openxmlformats.org/officeDocument/2006/math" xmlns:v="urn:schemas-microsoft-com:vml" xmlns:wp14="http://schemas.microsoft.com/office/word/2010/wordprocessingDrawing" xmlns:wp="http://schemas.openxmlformats.org/drawingml/2006/wordprocessingDrawing" xmlns:w10="urn:schemas-microsoft-com:office:word" xmlns:w="http://schemas.openxmlformats.org/wordprocessingml/2006/main" xmlns:w14="http://schemas.microsoft.com/office/word/2010/wordml" xmlns:w15="http://schemas.microsoft.com/office/word/2012/wordml" xmlns:w16cei="http://schemas.microsoft.com/office/word/2026/wordml/cei" xmlns:w16cex="http://schemas.microsoft.com/office/word/2018/wordml/cex" xmlns:w16cid="http://schemas.microsoft.com/office/word/2016/wordml/cid" xmlns:w16="http://schemas.microsoft.com/office/word/2018/wordml" xmlns:w16du="http://schemas.microsoft.com/office/word/2023/wordml/word16du" xmlns:w16sdtdh="http://schemas.microsoft.com/office/word/2020/wordml/sdtdatahash" xmlns:w16sdtfl="http://schemas.microsoft.com/office/word/2024/wordml/sdtformatlock" xmlns:w16se="http://schemas.microsoft.com/office/word/2015/wordml/symex" xmlns:wpg="http://schemas.microsoft.com/office/word/2010/wordprocessingGroup" xmlns:wpi="http://schemas.microsoft.com/office/word/2010/wordprocessingInk" xmlns:wne="http://schemas.microsoft.com/office/word/2006/wordml" xmlns:wps="http://schemas.microsoft.com/office/word/2010/wordprocessingShape" mc:Ignorable="w14 w15 w16se w16cid w16 w16cex w16sdtdh w16sdtfl w16du wp14">
   <w:abstractNum w:abstractNumId="0" w15:restartNumberingAfterBreak="0">
     <w:nsid w:val="145119B3"/>
     <w:multiLevelType w:val="hybridMultilevel"/>
@@ -2802,6 +2834,21 @@
 </file>
 
 <file path=customXml/item1.xml><?xml version="1.0" encoding="utf-8"?>
+<p:properties xmlns:p="http://schemas.microsoft.com/office/2006/metadata/properties" xmlns:xsi="http://www.w3.org/2001/XMLSchema-instance" xmlns:pc="http://schemas.microsoft.com/office/infopath/2007/PartnerControls">
+  <documentManagement>
+    <lcf76f155ced4ddcb4097134ff3c332f xmlns="e789b7fa-a83c-4c6b-9e01-87c723f67228">
+      <Terms xmlns="http://schemas.microsoft.com/office/infopath/2007/PartnerControls"/>
+    </lcf76f155ced4ddcb4097134ff3c332f>
+    <TaxCatchAll xmlns="bb952b06-3268-4e55-b0fe-9eb49669fc08" xsi:nil="true"/>
+  </documentManagement>
+</p:properties>
+</file>
+
+<file path=customXml/item2.xml><?xml version="1.0" encoding="utf-8"?>
+<b:Sources xmlns:b="http://schemas.openxmlformats.org/officeDocument/2006/bibliography" xmlns="http://schemas.openxmlformats.org/officeDocument/2006/bibliography" SelectedStyle="/APASixthEditionOfficeOnline.xsl" StyleName="APA" Version="6"/>
+</file>
+
+<file path=customXml/item3.xml><?xml version="1.0" encoding="utf-8"?>
 <ct:contentTypeSchema xmlns:ct="http://schemas.microsoft.com/office/2006/metadata/contentType" xmlns:ma="http://schemas.microsoft.com/office/2006/metadata/properties/metaAttributes" ct:_="" ma:_="" ma:contentTypeName="Document" ma:contentTypeID="0x010100B89331DE8EA64F4FBEA00113BF0E4514" ma:contentTypeVersion="11" ma:contentTypeDescription="Create a new document." ma:contentTypeScope="" ma:versionID="0b60b04e60edb8b2e7e2fe1cc7d413e0">
   <xsd:schema xmlns:xsd="http://www.w3.org/2001/XMLSchema" xmlns:xs="http://www.w3.org/2001/XMLSchema" xmlns:p="http://schemas.microsoft.com/office/2006/metadata/properties" xmlns:ns2="e789b7fa-a83c-4c6b-9e01-87c723f67228" xmlns:ns3="bb952b06-3268-4e55-b0fe-9eb49669fc08" targetNamespace="http://schemas.microsoft.com/office/2006/metadata/properties" ma:root="true" ma:fieldsID="52467e30880403e5f73a15b97b0992c8" ns2:_="" ns3:_="">
     <xsd:import namespace="e789b7fa-a83c-4c6b-9e01-87c723f67228"/>
@@ -2996,21 +3043,6 @@
 </ct:contentTypeSchema>
 </file>
 
-<file path=customXml/item2.xml><?xml version="1.0" encoding="utf-8"?>
-<b:Sources xmlns:b="http://schemas.openxmlformats.org/officeDocument/2006/bibliography" xmlns="http://schemas.openxmlformats.org/officeDocument/2006/bibliography" SelectedStyle="/APASixthEditionOfficeOnline.xsl" StyleName="APA" Version="6"/>
-</file>
-
-<file path=customXml/item3.xml><?xml version="1.0" encoding="utf-8"?>
-<p:properties xmlns:p="http://schemas.microsoft.com/office/2006/metadata/properties" xmlns:xsi="http://www.w3.org/2001/XMLSchema-instance" xmlns:pc="http://schemas.microsoft.com/office/infopath/2007/PartnerControls">
-  <documentManagement>
-    <lcf76f155ced4ddcb4097134ff3c332f xmlns="e789b7fa-a83c-4c6b-9e01-87c723f67228">
-      <Terms xmlns="http://schemas.microsoft.com/office/infopath/2007/PartnerControls"/>
-    </lcf76f155ced4ddcb4097134ff3c332f>
-    <TaxCatchAll xmlns="bb952b06-3268-4e55-b0fe-9eb49669fc08" xsi:nil="true"/>
-  </documentManagement>
-</p:properties>
-</file>
-
 <file path=customXml/item4.xml><?xml version="1.0" encoding="utf-8"?>
 <?mso-contentType ?>
 <FormTemplates xmlns="http://schemas.microsoft.com/sharepoint/v3/contenttype/forms">
@@ -3021,6 +3053,25 @@
 </file>
 
 <file path=customXml/itemProps1.xml><?xml version="1.0" encoding="utf-8"?>
+<ds:datastoreItem xmlns:ds="http://schemas.openxmlformats.org/officeDocument/2006/customXml" ds:itemID="{EF43FDED-CD1D-4301-B761-71C1DCC851CC}">
+  <ds:schemaRefs>
+    <ds:schemaRef ds:uri="http://schemas.microsoft.com/office/2006/metadata/properties"/>
+    <ds:schemaRef ds:uri="http://schemas.microsoft.com/office/infopath/2007/PartnerControls"/>
+    <ds:schemaRef ds:uri="e789b7fa-a83c-4c6b-9e01-87c723f67228"/>
+    <ds:schemaRef ds:uri="bb952b06-3268-4e55-b0fe-9eb49669fc08"/>
+  </ds:schemaRefs>
+</ds:datastoreItem>
+</file>
+
+<file path=customXml/itemProps2.xml><?xml version="1.0" encoding="utf-8"?>
+<ds:datastoreItem xmlns:ds="http://schemas.openxmlformats.org/officeDocument/2006/customXml" ds:itemID="{3B4892E8-18D6-D444-BA6E-299F0B60384F}">
+  <ds:schemaRefs>
+    <ds:schemaRef ds:uri="http://schemas.openxmlformats.org/officeDocument/2006/bibliography"/>
+  </ds:schemaRefs>
+</ds:datastoreItem>
+</file>
+
+<file path=customXml/itemProps3.xml><?xml version="1.0" encoding="utf-8"?>
 <ds:datastoreItem xmlns:ds="http://schemas.openxmlformats.org/officeDocument/2006/customXml" ds:itemID="{93F00A47-6514-4C46-91C6-8D2331E8318E}">
   <ds:schemaRefs>
     <ds:schemaRef ds:uri="http://schemas.microsoft.com/office/2006/metadata/contentType"/>
@@ -3039,25 +3090,6 @@
 </ds:datastoreItem>
 </file>
 
-<file path=customXml/itemProps2.xml><?xml version="1.0" encoding="utf-8"?>
-<ds:datastoreItem xmlns:ds="http://schemas.openxmlformats.org/officeDocument/2006/customXml" ds:itemID="{3B4892E8-18D6-D444-BA6E-299F0B60384F}">
-  <ds:schemaRefs>
-    <ds:schemaRef ds:uri="http://schemas.openxmlformats.org/officeDocument/2006/bibliography"/>
-  </ds:schemaRefs>
-</ds:datastoreItem>
-</file>
-
-<file path=customXml/itemProps3.xml><?xml version="1.0" encoding="utf-8"?>
-<ds:datastoreItem xmlns:ds="http://schemas.openxmlformats.org/officeDocument/2006/customXml" ds:itemID="{EF43FDED-CD1D-4301-B761-71C1DCC851CC}">
-  <ds:schemaRefs>
-    <ds:schemaRef ds:uri="http://schemas.microsoft.com/office/2006/metadata/properties"/>
-    <ds:schemaRef ds:uri="http://schemas.microsoft.com/office/infopath/2007/PartnerControls"/>
-    <ds:schemaRef ds:uri="e789b7fa-a83c-4c6b-9e01-87c723f67228"/>
-    <ds:schemaRef ds:uri="bb952b06-3268-4e55-b0fe-9eb49669fc08"/>
-  </ds:schemaRefs>
-</ds:datastoreItem>
-</file>
-
 <file path=customXml/itemProps4.xml><?xml version="1.0" encoding="utf-8"?>
 <ds:datastoreItem xmlns:ds="http://schemas.openxmlformats.org/officeDocument/2006/customXml" ds:itemID="{45FB1F57-968F-4A6E-AEE9-65961EB5FADD}">
   <ds:schemaRefs>

</xml_diff>